<commit_message>
chore: consolidate rendering and exemplar release hardening
</commit_message>
<xml_diff>
--- a/projects/templates/template_code_project/output/docx/template_code_project_combined.docx
+++ b/projects/templates/template_code_project/output/docx/template_code_project_combined.docx
@@ -13951,7 +13951,7 @@
               <w:pStyle w:val="Compact"/>
             </w:pPr>
             <w:r>
-              <w:t xml:space="preserve">9</w:t>
+              <w:t xml:space="preserve">7</w:t>
             </w:r>
           </w:p>
         </w:tc>
@@ -13975,7 +13975,7 @@
               <w:pStyle w:val="Compact"/>
             </w:pPr>
             <w:r>
-              <w:t xml:space="preserve">5</w:t>
+              <w:t xml:space="preserve">3</w:t>
             </w:r>
           </w:p>
         </w:tc>
@@ -13999,7 +13999,7 @@
               <w:pStyle w:val="Compact"/>
             </w:pPr>
             <w:r>
-              <w:t xml:space="preserve">16</w:t>
+              <w:t xml:space="preserve">6</w:t>
             </w:r>
           </w:p>
         </w:tc>
@@ -14031,7 +14031,7 @@
                 <w:b/>
                 <w:bCs/>
               </w:rPr>
-              <w:t xml:space="preserve">30</w:t>
+              <w:t xml:space="preserve">16</w:t>
             </w:r>
           </w:p>
         </w:tc>

</xml_diff>

<commit_message>
feat(template): harden readiness, provenance, and rendering outputs
</commit_message>
<xml_diff>
--- a/projects/templates/template_code_project/output/docx/template_code_project_combined.docx
+++ b/projects/templates/template_code_project/output/docx/template_code_project_combined.docx
@@ -2372,7 +2372,7 @@
     </w:p>
     <w:bookmarkEnd w:id="26"/>
     <w:bookmarkEnd w:id="27"/>
-    <w:bookmarkStart w:id="48" w:name="sec:methodology"/>
+    <w:bookmarkStart w:id="47" w:name="sec:methodology"/>
     <w:p>
       <w:pPr>
         <w:pStyle w:val="Heading1"/>
@@ -3486,7 +3486,7 @@
       </w:r>
     </w:p>
     <w:bookmarkEnd w:id="38"/>
-    <w:bookmarkStart w:id="45" w:name="experimental-setup"/>
+    <w:bookmarkStart w:id="44" w:name="experimental-setup"/>
     <w:p>
       <w:pPr>
         <w:pStyle w:val="Heading2"/>
@@ -4034,7 +4034,7 @@
       </w:r>
     </w:p>
     <w:bookmarkEnd w:id="39"/>
-    <w:bookmarkStart w:id="42" w:name="zero-mock-testing-methodology"/>
+    <w:bookmarkStart w:id="41" w:name="zero-mock-testing-methodology"/>
     <w:p>
       <w:pPr>
         <w:pStyle w:val="Heading3"/>
@@ -4087,59 +4087,59 @@
       <w:r>
         <w:t xml:space="preserve"> </w:t>
       </w:r>
+      <w:hyperlink r:id="rId17">
+        <w:r>
+          <w:rPr>
+            <w:rStyle w:val="Hyperlink"/>
+          </w:rPr>
+          <w:t xml:space="preserve">the project optimizer test suite</w:t>
+        </w:r>
+      </w:hyperlink>
+      <w:r>
+        <w:t xml:space="preserve"> </w:t>
+      </w:r>
+      <w:r>
+        <w:t xml:space="preserve">exercises</w:t>
+      </w:r>
+      <w:r>
+        <w:t xml:space="preserve"> </w:t>
+      </w:r>
+      <w:r>
+        <w:rPr>
+          <w:rStyle w:val="VerbatimChar"/>
+        </w:rPr>
+        <w:t xml:space="preserve">src/optimizer.py</w:t>
+      </w:r>
+      <w:r>
+        <w:t xml:space="preserve"> </w:t>
+      </w:r>
+      <w:r>
+        <w:t xml:space="preserve">(typical, edge, boundary, and pathological inputs including NaN/Inf and zero gradients) and, when infrastructure imports succeed, call into</w:t>
+      </w:r>
+      <w:r>
+        <w:t xml:space="preserve"> </w:t>
+      </w:r>
+      <w:r>
+        <w:rPr>
+          <w:rStyle w:val="VerbatimChar"/>
+        </w:rPr>
+        <w:t xml:space="preserve">optimization_analysis.py</w:t>
+      </w:r>
+      <w:r>
+        <w:t xml:space="preserve"> </w:t>
+      </w:r>
+      <w:r>
+        <w:t xml:space="preserve">helpers—without mocks. Suite size:</w:t>
+      </w:r>
+      <w:r>
+        <w:t xml:space="preserve"> </w:t>
+      </w:r>
       <w:hyperlink r:id="rId40">
         <w:r>
           <w:rPr>
-            <w:rStyle w:val="VerbatimChar"/>
+            <w:rStyle w:val="Hyperlink"/>
           </w:rPr>
-          <w:t xml:space="preserve">projects/templates/template_code_project/tests/test_optimizer.py</w:t>
-        </w:r>
-      </w:hyperlink>
-      <w:r>
-        <w:t xml:space="preserve"> </w:t>
-      </w:r>
-      <w:r>
-        <w:t xml:space="preserve">exercises</w:t>
-      </w:r>
-      <w:r>
-        <w:t xml:space="preserve"> </w:t>
-      </w:r>
-      <w:r>
-        <w:rPr>
-          <w:rStyle w:val="VerbatimChar"/>
-        </w:rPr>
-        <w:t xml:space="preserve">src/optimizer.py</w:t>
-      </w:r>
-      <w:r>
-        <w:t xml:space="preserve"> </w:t>
-      </w:r>
-      <w:r>
-        <w:t xml:space="preserve">(typical, edge, boundary, and pathological inputs including NaN/Inf and zero gradients) and, when infrastructure imports succeed, call into</w:t>
-      </w:r>
-      <w:r>
-        <w:t xml:space="preserve"> </w:t>
-      </w:r>
-      <w:r>
-        <w:rPr>
-          <w:rStyle w:val="VerbatimChar"/>
-        </w:rPr>
-        <w:t xml:space="preserve">optimization_analysis.py</w:t>
-      </w:r>
-      <w:r>
-        <w:t xml:space="preserve"> </w:t>
-      </w:r>
-      <w:r>
-        <w:t xml:space="preserve">helpers—without mocks. Suite size:</w:t>
-      </w:r>
-      <w:r>
-        <w:t xml:space="preserve"> </w:t>
-      </w:r>
-      <w:hyperlink r:id="rId41">
-        <w:r>
-          <w:rPr>
-            <w:rStyle w:val="VerbatimChar"/>
-          </w:rPr>
-          <w:t xml:space="preserve">docs/_generated/COUNTS.md</w:t>
+          <w:t xml:space="preserve">the measured repository counts</w:t>
         </w:r>
       </w:hyperlink>
       <w:r>
@@ -4231,8 +4231,8 @@
         <w:t xml:space="preserve">prior to treating the project as build-green.</w:t>
       </w:r>
     </w:p>
-    <w:bookmarkEnd w:id="42"/>
-    <w:bookmarkStart w:id="43" w:name="stopping-rule-and-reporting"/>
+    <w:bookmarkEnd w:id="41"/>
+    <w:bookmarkStart w:id="42" w:name="stopping-rule-and-reporting"/>
     <w:p>
       <w:pPr>
         <w:pStyle w:val="Heading3"/>
@@ -4424,14 +4424,221 @@
         <w:t xml:space="preserve">placeholders so tables and prose cannot drift from the last analysis run.</w:t>
       </w:r>
     </w:p>
+    <w:bookmarkEnd w:id="42"/>
+    <w:bookmarkStart w:id="43" w:name="figure-generation-contract"/>
+    <w:p>
+      <w:pPr>
+        <w:pStyle w:val="Heading3"/>
+      </w:pPr>
+      <w:r>
+        <w:t xml:space="preserve">Figure generation contract</w:t>
+      </w:r>
+    </w:p>
+    <w:p>
+      <w:pPr>
+        <w:pStyle w:val="FirstParagraph"/>
+      </w:pPr>
+      <w:r>
+        <w:t xml:space="preserve">Each figure in</w:t>
+      </w:r>
+      <w:r>
+        <w:t xml:space="preserve"> </w:t>
+      </w:r>
+      <w:r>
+        <w:rPr>
+          <w:rStyle w:val="VerbatimChar"/>
+        </w:rPr>
+        <w:t xml:space="preserve">03_results.md</w:t>
+      </w:r>
+      <w:r>
+        <w:t xml:space="preserve"> </w:t>
+      </w:r>
+      <w:r>
+        <w:t xml:space="preserve">maps to a generator in</w:t>
+      </w:r>
+      <w:r>
+        <w:t xml:space="preserve"> </w:t>
+      </w:r>
+      <w:r>
+        <w:rPr>
+          <w:rStyle w:val="VerbatimChar"/>
+        </w:rPr>
+        <w:t xml:space="preserve">src/figures/</w:t>
+      </w:r>
+      <w:r>
+        <w:t xml:space="preserve"> </w:t>
+      </w:r>
+      <w:r>
+        <w:t xml:space="preserve">(</w:t>
+      </w:r>
+      <w:r>
+        <w:rPr>
+          <w:rStyle w:val="VerbatimChar"/>
+        </w:rPr>
+        <w:t xml:space="preserve">generate_convergence_plot</w:t>
+      </w:r>
+      <w:r>
+        <w:t xml:space="preserve">,</w:t>
+      </w:r>
+      <w:r>
+        <w:t xml:space="preserve"> </w:t>
+      </w:r>
+      <w:r>
+        <w:rPr>
+          <w:rStyle w:val="VerbatimChar"/>
+        </w:rPr>
+        <w:t xml:space="preserve">generate_step_size_sensitivity_plot</w:t>
+      </w:r>
+      <w:r>
+        <w:t xml:space="preserve">,</w:t>
+      </w:r>
+      <w:r>
+        <w:t xml:space="preserve"> </w:t>
+      </w:r>
+      <w:r>
+        <w:rPr>
+          <w:rStyle w:val="VerbatimChar"/>
+        </w:rPr>
+        <w:t xml:space="preserve">generate_convergence_rate_plot</w:t>
+      </w:r>
+      <w:r>
+        <w:t xml:space="preserve">,</w:t>
+      </w:r>
+      <w:r>
+        <w:t xml:space="preserve"> </w:t>
+      </w:r>
+      <w:r>
+        <w:rPr>
+          <w:rStyle w:val="VerbatimChar"/>
+        </w:rPr>
+        <w:t xml:space="preserve">generate_complexity_visualization</w:t>
+      </w:r>
+      <w:r>
+        <w:t xml:space="preserve">,</w:t>
+      </w:r>
+      <w:r>
+        <w:t xml:space="preserve"> </w:t>
+      </w:r>
+      <w:r>
+        <w:rPr>
+          <w:rStyle w:val="VerbatimChar"/>
+        </w:rPr>
+        <w:t xml:space="preserve">generate_stability_visualization</w:t>
+      </w:r>
+      <w:r>
+        <w:t xml:space="preserve">,</w:t>
+      </w:r>
+      <w:r>
+        <w:t xml:space="preserve"> </w:t>
+      </w:r>
+      <w:r>
+        <w:rPr>
+          <w:rStyle w:val="VerbatimChar"/>
+        </w:rPr>
+        <w:t xml:space="preserve">generate_benchmark_visualization</w:t>
+      </w:r>
+      <w:r>
+        <w:t xml:space="preserve">), orchestrated by</w:t>
+      </w:r>
+      <w:r>
+        <w:t xml:space="preserve"> </w:t>
+      </w:r>
+      <w:r>
+        <w:rPr>
+          <w:rStyle w:val="VerbatimChar"/>
+        </w:rPr>
+        <w:t xml:space="preserve">src/analysis/</w:t>
+      </w:r>
+      <w:r>
+        <w:t xml:space="preserve"> </w:t>
+      </w:r>
+      <w:r>
+        <w:t xml:space="preserve">/</w:t>
+      </w:r>
+      <w:r>
+        <w:t xml:space="preserve"> </w:t>
+      </w:r>
+      <w:r>
+        <w:rPr>
+          <w:rStyle w:val="VerbatimChar"/>
+        </w:rPr>
+        <w:t xml:space="preserve">scripts/optimization_analysis.py</w:t>
+      </w:r>
+      <w:r>
+        <w:t xml:space="preserve">. Captions in the markdown intentionally name the function and the key parameters (tolerance lines, grids, dimensions) so reviewers can navigate from PDF to code without inferring hidden defaults.</w:t>
+      </w:r>
+    </w:p>
+    <w:p>
+      <w:pPr>
+        <w:pStyle w:val="BodyText"/>
+      </w:pPr>
+      <w:r>
+        <w:t xml:space="preserve">The same generator writes explicit</w:t>
+      </w:r>
+      <w:r>
+        <w:t xml:space="preserve"> </w:t>
+      </w:r>
+      <w:r>
+        <w:rPr>
+          <w:rStyle w:val="VerbatimChar"/>
+        </w:rPr>
+        <w:t xml:space="preserve">metadata.alt_text</w:t>
+      </w:r>
+      <w:r>
+        <w:t xml:space="preserve"> </w:t>
+      </w:r>
+      <w:r>
+        <w:t xml:space="preserve">for every registered</w:t>
+      </w:r>
+      <w:r>
+        <w:t xml:space="preserve"> </w:t>
+      </w:r>
+      <w:r>
+        <w:t xml:space="preserve">figure. The alt text states what the visual encodes and preserves the boundary</w:t>
+      </w:r>
+      <w:r>
+        <w:t xml:space="preserve"> </w:t>
+      </w:r>
+      <w:r>
+        <w:t xml:space="preserve">between deterministic observations and host-dependent diagnostics. Run the</w:t>
+      </w:r>
+      <w:r>
+        <w:t xml:space="preserve"> </w:t>
+      </w:r>
+      <w:r>
+        <w:t xml:space="preserve">opt-in publication migration gate with</w:t>
+      </w:r>
+      <w:r>
+        <w:t xml:space="preserve"> </w:t>
+      </w:r>
+      <w:r>
+        <w:rPr>
+          <w:rStyle w:val="VerbatimChar"/>
+        </w:rPr>
+        <w:t xml:space="preserve">--require-figure-accessibility</w:t>
+      </w:r>
+      <w:r>
+        <w:t xml:space="preserve"> </w:t>
+      </w:r>
+      <w:r>
+        <w:t xml:space="preserve">to verify that every referenced figure has</w:t>
+      </w:r>
+      <w:r>
+        <w:t xml:space="preserve"> </w:t>
+      </w:r>
+      <w:r>
+        <w:t xml:space="preserve">this metadata before promotion.</w:t>
+      </w:r>
+    </w:p>
     <w:bookmarkEnd w:id="43"/>
-    <w:bookmarkStart w:id="44" w:name="figure-generation-contract"/>
-    <w:p>
-      <w:pPr>
-        <w:pStyle w:val="Heading3"/>
-      </w:pPr>
-      <w:r>
-        <w:t xml:space="preserve">Figure generation contract</w:t>
+    <w:bookmarkEnd w:id="44"/>
+    <w:bookmarkStart w:id="46" w:name="analysis-pipeline-latex-integration"/>
+    <w:p>
+      <w:pPr>
+        <w:pStyle w:val="Heading2"/>
+      </w:pPr>
+      <w:r>
+        <w:t xml:space="preserve">Analysis Pipeline &amp; LaTeX Integration</w:t>
       </w:r>
     </w:p>
     <w:p>
@@ -4439,219 +4646,12 @@
         <w:pStyle w:val="FirstParagraph"/>
       </w:pPr>
       <w:r>
-        <w:t xml:space="preserve">Each figure in</w:t>
-      </w:r>
-      <w:r>
-        <w:t xml:space="preserve"> </w:t>
-      </w:r>
-      <w:r>
-        <w:rPr>
-          <w:rStyle w:val="VerbatimChar"/>
-        </w:rPr>
-        <w:t xml:space="preserve">03_results.md</w:t>
-      </w:r>
-      <w:r>
-        <w:t xml:space="preserve"> </w:t>
-      </w:r>
-      <w:r>
-        <w:t xml:space="preserve">maps to a generator in</w:t>
-      </w:r>
-      <w:r>
-        <w:t xml:space="preserve"> </w:t>
-      </w:r>
-      <w:r>
-        <w:rPr>
-          <w:rStyle w:val="VerbatimChar"/>
-        </w:rPr>
-        <w:t xml:space="preserve">src/figures/</w:t>
-      </w:r>
-      <w:r>
-        <w:t xml:space="preserve"> </w:t>
-      </w:r>
-      <w:r>
-        <w:t xml:space="preserve">(</w:t>
-      </w:r>
-      <w:r>
-        <w:rPr>
-          <w:rStyle w:val="VerbatimChar"/>
-        </w:rPr>
-        <w:t xml:space="preserve">generate_convergence_plot</w:t>
-      </w:r>
-      <w:r>
-        <w:t xml:space="preserve">,</w:t>
-      </w:r>
-      <w:r>
-        <w:t xml:space="preserve"> </w:t>
-      </w:r>
-      <w:r>
-        <w:rPr>
-          <w:rStyle w:val="VerbatimChar"/>
-        </w:rPr>
-        <w:t xml:space="preserve">generate_step_size_sensitivity_plot</w:t>
-      </w:r>
-      <w:r>
-        <w:t xml:space="preserve">,</w:t>
-      </w:r>
-      <w:r>
-        <w:t xml:space="preserve"> </w:t>
-      </w:r>
-      <w:r>
-        <w:rPr>
-          <w:rStyle w:val="VerbatimChar"/>
-        </w:rPr>
-        <w:t xml:space="preserve">generate_convergence_rate_plot</w:t>
-      </w:r>
-      <w:r>
-        <w:t xml:space="preserve">,</w:t>
-      </w:r>
-      <w:r>
-        <w:t xml:space="preserve"> </w:t>
-      </w:r>
-      <w:r>
-        <w:rPr>
-          <w:rStyle w:val="VerbatimChar"/>
-        </w:rPr>
-        <w:t xml:space="preserve">generate_complexity_visualization</w:t>
-      </w:r>
-      <w:r>
-        <w:t xml:space="preserve">,</w:t>
-      </w:r>
-      <w:r>
-        <w:t xml:space="preserve"> </w:t>
-      </w:r>
-      <w:r>
-        <w:rPr>
-          <w:rStyle w:val="VerbatimChar"/>
-        </w:rPr>
-        <w:t xml:space="preserve">generate_stability_visualization</w:t>
-      </w:r>
-      <w:r>
-        <w:t xml:space="preserve">,</w:t>
-      </w:r>
-      <w:r>
-        <w:t xml:space="preserve"> </w:t>
-      </w:r>
-      <w:r>
-        <w:rPr>
-          <w:rStyle w:val="VerbatimChar"/>
-        </w:rPr>
-        <w:t xml:space="preserve">generate_benchmark_visualization</w:t>
-      </w:r>
-      <w:r>
-        <w:t xml:space="preserve">), orchestrated by</w:t>
-      </w:r>
-      <w:r>
-        <w:t xml:space="preserve"> </w:t>
-      </w:r>
-      <w:r>
-        <w:rPr>
-          <w:rStyle w:val="VerbatimChar"/>
-        </w:rPr>
-        <w:t xml:space="preserve">src/analysis/</w:t>
-      </w:r>
-      <w:r>
-        <w:t xml:space="preserve"> </w:t>
-      </w:r>
-      <w:r>
-        <w:t xml:space="preserve">/</w:t>
-      </w:r>
-      <w:r>
-        <w:t xml:space="preserve"> </w:t>
-      </w:r>
-      <w:r>
-        <w:rPr>
-          <w:rStyle w:val="VerbatimChar"/>
-        </w:rPr>
-        <w:t xml:space="preserve">scripts/optimization_analysis.py</w:t>
-      </w:r>
-      <w:r>
-        <w:t xml:space="preserve">. Captions in the markdown intentionally name the function and the key parameters (tolerance lines, grids, dimensions) so reviewers can navigate from PDF to code without inferring hidden defaults.</w:t>
-      </w:r>
-    </w:p>
-    <w:p>
-      <w:pPr>
-        <w:pStyle w:val="BodyText"/>
-      </w:pPr>
-      <w:r>
-        <w:t xml:space="preserve">The same generator writes explicit</w:t>
-      </w:r>
-      <w:r>
-        <w:t xml:space="preserve"> </w:t>
-      </w:r>
-      <w:r>
-        <w:rPr>
-          <w:rStyle w:val="VerbatimChar"/>
-        </w:rPr>
-        <w:t xml:space="preserve">metadata.alt_text</w:t>
-      </w:r>
-      <w:r>
-        <w:t xml:space="preserve"> </w:t>
-      </w:r>
-      <w:r>
-        <w:t xml:space="preserve">for every registered</w:t>
-      </w:r>
-      <w:r>
-        <w:t xml:space="preserve"> </w:t>
-      </w:r>
-      <w:r>
-        <w:t xml:space="preserve">figure. The alt text states what the visual encodes and preserves the boundary</w:t>
-      </w:r>
-      <w:r>
-        <w:t xml:space="preserve"> </w:t>
-      </w:r>
-      <w:r>
-        <w:t xml:space="preserve">between deterministic observations and host-dependent diagnostics. Run the</w:t>
-      </w:r>
-      <w:r>
-        <w:t xml:space="preserve"> </w:t>
-      </w:r>
-      <w:r>
-        <w:t xml:space="preserve">opt-in publication migration gate with</w:t>
-      </w:r>
-      <w:r>
-        <w:t xml:space="preserve"> </w:t>
-      </w:r>
-      <w:r>
-        <w:rPr>
-          <w:rStyle w:val="VerbatimChar"/>
-        </w:rPr>
-        <w:t xml:space="preserve">--require-figure-accessibility</w:t>
-      </w:r>
-      <w:r>
-        <w:t xml:space="preserve"> </w:t>
-      </w:r>
-      <w:r>
-        <w:t xml:space="preserve">to verify that every referenced figure has</w:t>
-      </w:r>
-      <w:r>
-        <w:t xml:space="preserve"> </w:t>
-      </w:r>
-      <w:r>
-        <w:t xml:space="preserve">this metadata before promotion.</w:t>
-      </w:r>
-    </w:p>
-    <w:bookmarkEnd w:id="44"/>
-    <w:bookmarkEnd w:id="45"/>
-    <w:bookmarkStart w:id="47" w:name="analysis-pipeline-latex-integration"/>
-    <w:p>
-      <w:pPr>
-        <w:pStyle w:val="Heading2"/>
-      </w:pPr>
-      <w:r>
-        <w:t xml:space="preserve">Analysis Pipeline &amp; LaTeX Integration</w:t>
-      </w:r>
-    </w:p>
-    <w:p>
-      <w:pPr>
-        <w:pStyle w:val="FirstParagraph"/>
-      </w:pPr>
-      <w:r>
         <w:t xml:space="preserve">The automated analysis script leverages</w:t>
       </w:r>
       <w:r>
         <w:t xml:space="preserve"> </w:t>
       </w:r>
-      <w:hyperlink r:id="rId46">
+      <w:hyperlink r:id="rId45">
         <w:r>
           <w:rPr>
             <w:rStyle w:val="VerbatimChar"/>
@@ -4737,9 +4737,9 @@
         <w:t xml:space="preserve">, automatically linking compiled PGF plots and BibTeX citations. This automated approach ensures an unbreakable chain of custody from raw algorithmic execution to the final rendered manuscript.</w:t>
       </w:r>
     </w:p>
+    <w:bookmarkEnd w:id="46"/>
     <w:bookmarkEnd w:id="47"/>
-    <w:bookmarkEnd w:id="48"/>
-    <w:bookmarkStart w:id="96" w:name="sec:results"/>
+    <w:bookmarkStart w:id="95" w:name="sec:results"/>
     <w:p>
       <w:pPr>
         <w:pStyle w:val="Heading1"/>
@@ -4785,7 +4785,7 @@
         <w:t xml:space="preserve">. No manual transcription was permitted.</w:t>
       </w:r>
     </w:p>
-    <w:bookmarkStart w:id="59" w:name="convergence-analysis-1"/>
+    <w:bookmarkStart w:id="58" w:name="convergence-analysis-1"/>
     <w:p>
       <w:pPr>
         <w:pStyle w:val="Heading2"/>
@@ -4794,7 +4794,7 @@
         <w:t xml:space="preserve">Convergence Analysis</w:t>
       </w:r>
     </w:p>
-    <w:bookmarkStart w:id="53" w:name="convergence-trajectories"/>
+    <w:bookmarkStart w:id="52" w:name="convergence-trajectories"/>
     <w:p>
       <w:pPr>
         <w:pStyle w:val="Heading3"/>
@@ -4929,7 +4929,7 @@
         <w:t xml:space="preserve">.</w:t>
       </w:r>
     </w:p>
-    <w:bookmarkStart w:id="52" w:name="fig:convergence"/>
+    <w:bookmarkStart w:id="51" w:name="fig:convergence"/>
     <w:p>
       <w:pPr>
         <w:pStyle w:val="CaptionedFigure"/>
@@ -4939,18 +4939,18 @@
           <wp:inline>
             <wp:extent cx="5334000" cy="3707780"/>
             <wp:effectExtent b="0" l="0" r="0" t="0"/>
-            <wp:docPr descr="Figure 1: Objective value f(x_k)=\tfrac{1}{2}x_k^2 - x_k versus iteration k for gradient descent at six step sizes (legend colours follow the agency taxonomy in sec. 3: blue = conservative, green = near-optimal, orange = aggressive, red = divergent). Trajectories are produced by simulate_trajectory() in src/optimizer.py, which calls the same gradient_descent() used in tbl. 1; the upper bound on the y-axis clips the divergent \alpha=2.5 curve so that stable trajectories remain visible. Dashed grey reference line marks the analytic optimum f(x^\ast)=-0.5. Fastest configuration in this experiment: \alpha=1.0 converges in 1 iteration(s)." title="" id="50" name="Picture"/>
+            <wp:docPr descr="Figure 1: Objective value f(x_k)=\tfrac{1}{2}x_k^2 - x_k versus iteration k for gradient descent at six step sizes (legend colours follow the agency taxonomy in sec. 3: blue = conservative, green = near-optimal, orange = aggressive, red = divergent). Trajectories are produced by simulate_trajectory() in src/optimizer.py, which calls the same gradient_descent() used in tbl. 1; the upper bound on the y-axis clips the divergent \alpha=2.5 curve so that stable trajectories remain visible. Dashed grey reference line marks the analytic optimum f(x^\ast)=-0.5. Fastest configuration in this experiment: \alpha=1.0 converges in 1 iteration(s)." title="" id="49" name="Picture"/>
             <a:graphic>
               <a:graphicData uri="http://schemas.openxmlformats.org/drawingml/2006/picture">
                 <pic:pic>
                   <pic:nvPicPr>
-                    <pic:cNvPr descr="../figures/convergence_plot.png" id="51" name="Picture"/>
+                    <pic:cNvPr descr="../figures/convergence_plot.png" id="50" name="Picture"/>
                     <pic:cNvPicPr>
                       <a:picLocks noChangeArrowheads="1" noChangeAspect="1"/>
                     </pic:cNvPicPr>
                   </pic:nvPicPr>
                   <pic:blipFill>
-                    <a:blip r:embed="rId49"/>
+                    <a:blip r:embed="rId48"/>
                     <a:stretch>
                       <a:fillRect/>
                     </a:stretch>
@@ -5234,7 +5234,7 @@
         <w:t xml:space="preserve">converges in 1 iteration(s).</w:t>
       </w:r>
     </w:p>
-    <w:bookmarkEnd w:id="52"/>
+    <w:bookmarkEnd w:id="51"/>
     <w:p>
       <w:pPr>
         <w:pStyle w:val="BodyText"/>
@@ -5511,8 +5511,8 @@
         <w:t xml:space="preserve">diverges</w:t>
       </w:r>
     </w:p>
-    <w:bookmarkEnd w:id="53"/>
-    <w:bookmarkStart w:id="58" w:name="step-size-sensitivity-analysis"/>
+    <w:bookmarkEnd w:id="52"/>
+    <w:bookmarkStart w:id="57" w:name="step-size-sensitivity-analysis"/>
     <w:p>
       <w:pPr>
         <w:pStyle w:val="Heading3"/>
@@ -5529,7 +5529,7 @@
         <w:t xml:space="preserve">fig. 2 examines how the choice of step size affects the convergence path and solution quality. The analysis reveals the trade-off between convergence speed and numerical stability.</w:t>
       </w:r>
     </w:p>
-    <w:bookmarkStart w:id="57" w:name="fig:step_sensitivity"/>
+    <w:bookmarkStart w:id="56" w:name="fig:step_sensitivity"/>
     <w:p>
       <w:pPr>
         <w:pStyle w:val="CaptionedFigure"/>
@@ -5539,18 +5539,18 @@
           <wp:inline>
             <wp:extent cx="5334000" cy="2250763"/>
             <wp:effectExtent b="0" l="0" r="0" t="0"/>
-            <wp:docPr descr="Figure 2: Sensitivity sweep produced by generate_step_size_sensitivity_plot() over an independent dense grid \alpha \in [0.005, 0.4] (10 points), distinct from the discrete experiment.step_sizes used elsewhere in this section. Left: iterations to convergence on log–log axes — the curve drops sharply from 500 iterations at the smallest \alpha (the max_iterations cap in this sub-experiment) to 37 iterations at \alpha=0.4, illustrating the geometric speedup as \rho(\alpha)=|1-\alpha| shrinks. Right: final f(x) versus \alpha with horizontal reference lines at f(x_0)=0 (initial) and f(x^\ast)=-0.5 (analytic optimum); every \alpha in this stable window lands on the optimum." title="" id="55" name="Picture"/>
+            <wp:docPr descr="Figure 2: Sensitivity sweep produced by generate_step_size_sensitivity_plot() over an independent dense grid \alpha \in [0.005, 0.4] (10 points), distinct from the discrete experiment.step_sizes used elsewhere in this section. Left: iterations to convergence on log–log axes — the curve drops sharply from 500 iterations at the smallest \alpha (the max_iterations cap in this sub-experiment) to 37 iterations at \alpha=0.4, illustrating the geometric speedup as \rho(\alpha)=|1-\alpha| shrinks. Right: final f(x) versus \alpha with horizontal reference lines at f(x_0)=0 (initial) and f(x^\ast)=-0.5 (analytic optimum); every \alpha in this stable window lands on the optimum." title="" id="54" name="Picture"/>
             <a:graphic>
               <a:graphicData uri="http://schemas.openxmlformats.org/drawingml/2006/picture">
                 <pic:pic>
                   <pic:nvPicPr>
-                    <pic:cNvPr descr="../figures/step_size_sensitivity.png" id="56" name="Picture"/>
+                    <pic:cNvPr descr="../figures/step_size_sensitivity.png" id="55" name="Picture"/>
                     <pic:cNvPicPr>
                       <a:picLocks noChangeArrowheads="1" noChangeAspect="1"/>
                     </pic:cNvPicPr>
                   </pic:nvPicPr>
                   <pic:blipFill>
-                    <a:blip r:embed="rId54"/>
+                    <a:blip r:embed="rId53"/>
                     <a:stretch>
                       <a:fillRect/>
                     </a:stretch>
@@ -5927,10 +5927,10 @@
         <w:t xml:space="preserve">in this stable window lands on the optimum.</w:t>
       </w:r>
     </w:p>
+    <w:bookmarkEnd w:id="56"/>
     <w:bookmarkEnd w:id="57"/>
     <w:bookmarkEnd w:id="58"/>
-    <w:bookmarkEnd w:id="59"/>
-    <w:bookmarkStart w:id="62" w:name="quantitative-results"/>
+    <w:bookmarkStart w:id="61" w:name="quantitative-results"/>
     <w:p>
       <w:pPr>
         <w:pStyle w:val="Heading2"/>
@@ -5949,7 +5949,7 @@
       <w:r>
         <w:t xml:space="preserve"> </w:t>
       </w:r>
-      <w:hyperlink r:id="rId60">
+      <w:hyperlink r:id="rId59">
         <w:r>
           <w:rPr>
             <w:rStyle w:val="VerbatimChar"/>
@@ -6039,7 +6039,7 @@
         <w:t xml:space="preserve">).</w:t>
       </w:r>
     </w:p>
-    <w:bookmarkStart w:id="61" w:name="tbl:opt_results"/>
+    <w:bookmarkStart w:id="60" w:name="tbl:opt_results"/>
     <w:p>
       <w:pPr>
         <w:pStyle w:val="TableCaption"/>
@@ -6674,9 +6674,9 @@
         </w:tc>
       </w:tr>
     </w:tbl>
+    <w:bookmarkEnd w:id="60"/>
     <w:bookmarkEnd w:id="61"/>
-    <w:bookmarkEnd w:id="62"/>
-    <w:bookmarkStart w:id="70" w:name="convergence-rate-analysis"/>
+    <w:bookmarkStart w:id="69" w:name="convergence-rate-analysis"/>
     <w:p>
       <w:pPr>
         <w:pStyle w:val="Heading2"/>
@@ -6685,7 +6685,7 @@
         <w:t xml:space="preserve">Convergence Rate Analysis</w:t>
       </w:r>
     </w:p>
-    <w:bookmarkStart w:id="67" w:name="theoretical-vs-empirical-convergence"/>
+    <w:bookmarkStart w:id="66" w:name="theoretical-vs-empirical-convergence"/>
     <w:p>
       <w:pPr>
         <w:pStyle w:val="Heading3"/>
@@ -6719,7 +6719,7 @@
         <w:t xml:space="preserve">fig. 3 provides a comparative analysis of convergence rates across different step sizes, validating theoretical predictions against empirical results.</w:t>
       </w:r>
     </w:p>
-    <w:bookmarkStart w:id="66" w:name="fig:convergence_rate"/>
+    <w:bookmarkStart w:id="65" w:name="fig:convergence_rate"/>
     <w:p>
       <w:pPr>
         <w:pStyle w:val="CaptionedFigure"/>
@@ -6729,18 +6729,18 @@
           <wp:inline>
             <wp:extent cx="5334000" cy="3754843"/>
             <wp:effectExtent b="0" l="0" r="0" t="0"/>
-            <wp:docPr descr="Figure 3: Absolute objective error |f(x_k)-f(x^\ast)| versus iteration on a logarithmic y-axis, generated by generate_convergence_rate_plot(). Stable step sizes produce straight lines whose slopes equal 2\log_{10}\rho(\alpha) (per eq. ¿eq:convergence_bound?); \alpha=1.0 (\rho=0) collapses to the optimum in one step (vertical green line at k=1); \alpha=1.5 (orange) descends fastest among the multi-step contractions because \rho=0.5; the divergent \alpha=2.5 curve (red) climbs upward at slope 2\log_{10}(1.5). Horizontal dashed line marks the gradient-norm tolerance \varepsilon = 10^{-8} read from experiment.convergence_tolerance." title="" id="64" name="Picture"/>
+            <wp:docPr descr="Figure 3: Absolute objective error |f(x_k)-f(x^\ast)| versus iteration on a logarithmic y-axis, generated by generate_convergence_rate_plot(). Stable step sizes produce straight lines whose slopes equal 2\log_{10}\rho(\alpha) (per eq. ¿eq:convergence_bound?); \alpha=1.0 (\rho=0) collapses to the optimum in one step (vertical green line at k=1); \alpha=1.5 (orange) descends fastest among the multi-step contractions because \rho=0.5; the divergent \alpha=2.5 curve (red) climbs upward at slope 2\log_{10}(1.5). Horizontal dashed line marks the gradient-norm tolerance \varepsilon = 10^{-8} read from experiment.convergence_tolerance." title="" id="63" name="Picture"/>
             <a:graphic>
               <a:graphicData uri="http://schemas.openxmlformats.org/drawingml/2006/picture">
                 <pic:pic>
                   <pic:nvPicPr>
-                    <pic:cNvPr descr="../figures/convergence_rate_comparison.png" id="65" name="Picture"/>
+                    <pic:cNvPr descr="../figures/convergence_rate_comparison.png" id="64" name="Picture"/>
                     <pic:cNvPicPr>
                       <a:picLocks noChangeArrowheads="1" noChangeAspect="1"/>
                     </pic:cNvPicPr>
                   </pic:nvPicPr>
                   <pic:blipFill>
-                    <a:blip r:embed="rId63"/>
+                    <a:blip r:embed="rId62"/>
                     <a:stretch>
                       <a:fillRect/>
                     </a:stretch>
@@ -7147,7 +7147,7 @@
         <w:t xml:space="preserve">.</w:t>
       </w:r>
     </w:p>
-    <w:bookmarkEnd w:id="66"/>
+    <w:bookmarkEnd w:id="65"/>
     <w:p>
       <w:pPr>
         <w:pStyle w:val="BodyText"/>
@@ -7485,8 +7485,8 @@
         <w:t xml:space="preserve">.</w:t>
       </w:r>
     </w:p>
-    <w:bookmarkEnd w:id="67"/>
-    <w:bookmarkStart w:id="68" w:name="error-bounds"/>
+    <w:bookmarkEnd w:id="66"/>
+    <w:bookmarkStart w:id="67" w:name="error-bounds"/>
     <w:p>
       <w:pPr>
         <w:pStyle w:val="Heading3"/>
@@ -7837,8 +7837,8 @@
         <w:t xml:space="preserve">(divergence). tbl. 1 and figs. 1-3 ground these statements in the numbers produced by this repository run.</w:t>
       </w:r>
     </w:p>
-    <w:bookmarkEnd w:id="68"/>
-    <w:bookmarkStart w:id="69" w:name="performance-metrics"/>
+    <w:bookmarkEnd w:id="67"/>
+    <w:bookmarkStart w:id="68" w:name="performance-metrics"/>
     <w:p>
       <w:pPr>
         <w:pStyle w:val="Heading3"/>
@@ -8466,9 +8466,9 @@
         <w:t xml:space="preserve">divergent</w:t>
       </w:r>
     </w:p>
+    <w:bookmarkEnd w:id="68"/>
     <w:bookmarkEnd w:id="69"/>
-    <w:bookmarkEnd w:id="70"/>
-    <w:bookmarkStart w:id="73" w:name="performance-analysis"/>
+    <w:bookmarkStart w:id="72" w:name="performance-analysis"/>
     <w:p>
       <w:pPr>
         <w:pStyle w:val="Heading2"/>
@@ -8477,7 +8477,7 @@
         <w:t xml:space="preserve">Performance Analysis</w:t>
       </w:r>
     </w:p>
-    <w:bookmarkStart w:id="71" w:name="convergence-speed"/>
+    <w:bookmarkStart w:id="70" w:name="convergence-speed"/>
     <w:p>
       <w:pPr>
         <w:pStyle w:val="Heading3"/>
@@ -8518,8 +8518,8 @@
         <w:t xml:space="preserve">Large step sizes converge faster but may be less stable in more complex problems</w:t>
       </w:r>
     </w:p>
-    <w:bookmarkEnd w:id="71"/>
-    <w:bookmarkStart w:id="72" w:name="solution-accuracy"/>
+    <w:bookmarkEnd w:id="70"/>
+    <w:bookmarkStart w:id="71" w:name="solution-accuracy"/>
     <w:p>
       <w:pPr>
         <w:pStyle w:val="Heading3"/>
@@ -8766,9 +8766,9 @@
         <w:t xml:space="preserve">for convergence on quadratic objectives.</w:t>
       </w:r>
     </w:p>
+    <w:bookmarkEnd w:id="71"/>
     <w:bookmarkEnd w:id="72"/>
-    <w:bookmarkEnd w:id="73"/>
-    <w:bookmarkStart w:id="76" w:name="algorithm-characteristics"/>
+    <w:bookmarkStart w:id="75" w:name="algorithm-characteristics"/>
     <w:p>
       <w:pPr>
         <w:pStyle w:val="Heading2"/>
@@ -8777,7 +8777,7 @@
         <w:t xml:space="preserve">Algorithm Characteristics</w:t>
       </w:r>
     </w:p>
-    <w:bookmarkStart w:id="74" w:name="strengths"/>
+    <w:bookmarkStart w:id="73" w:name="strengths"/>
     <w:p>
       <w:pPr>
         <w:pStyle w:val="Heading3"/>
@@ -8843,8 +8843,8 @@
         <w:t xml:space="preserve">: Converges for convex functions under appropriate conditions</w:t>
       </w:r>
     </w:p>
-    <w:bookmarkEnd w:id="74"/>
-    <w:bookmarkStart w:id="75" w:name="limitations"/>
+    <w:bookmarkEnd w:id="73"/>
+    <w:bookmarkStart w:id="74" w:name="limitations"/>
     <w:p>
       <w:pPr>
         <w:pStyle w:val="Heading3"/>
@@ -8910,9 +8910,9 @@
         <w:t xml:space="preserve">: No adaptation to problem characteristics</w:t>
       </w:r>
     </w:p>
+    <w:bookmarkEnd w:id="74"/>
     <w:bookmarkEnd w:id="75"/>
-    <w:bookmarkEnd w:id="76"/>
-    <w:bookmarkStart w:id="93" w:name="computational-performance"/>
+    <w:bookmarkStart w:id="92" w:name="computational-performance"/>
     <w:p>
       <w:pPr>
         <w:pStyle w:val="Heading2"/>
@@ -8921,7 +8921,7 @@
         <w:t xml:space="preserve">Computational Performance</w:t>
       </w:r>
     </w:p>
-    <w:bookmarkStart w:id="81" w:name="algorithm-complexity-visualization"/>
+    <w:bookmarkStart w:id="80" w:name="algorithm-complexity-visualization"/>
     <w:p>
       <w:pPr>
         <w:pStyle w:val="Heading3"/>
@@ -8938,7 +8938,7 @@
         <w:t xml:space="preserve">fig. 4 provides a visualization of the algorithm’s computational characteristics, including time and space complexity analysis across different problem scales.</w:t>
       </w:r>
     </w:p>
-    <w:bookmarkStart w:id="80" w:name="fig:complexity"/>
+    <w:bookmarkStart w:id="79" w:name="fig:complexity"/>
     <w:p>
       <w:pPr>
         <w:pStyle w:val="CaptionedFigure"/>
@@ -8948,18 +8948,18 @@
           <wp:inline>
             <wp:extent cx="5334000" cy="6237349"/>
             <wp:effectExtent b="0" l="0" r="0" t="0"/>
-            <wp:docPr descr="Figure 4: Six-panel diagnostic from generate_complexity_visualization() (3×2 grid). Top left: bars give the empirical iteration count per configured \alpha, coloured by agency category; \alpha=1.0 achieves the global minimum of 1 step(s), while \alpha=0.01 saturates at the iteration cap N_{\max}=1000 (slow convergence) and \alpha=2.5 terminates early via a non_finite update (divergence). Top right: \log_{10}|f(x)-f(x^\ast)| at termination; the four converged rows reach \approx 10^{-16} (machine precision) while \alpha=0.01 stops near 10^{-9} at the cap. Dashed reference at \log_{10}\varepsilon for \varepsilon= experiment.convergence_tolerance. Middle left: empirical iterations (solid) versus the smooth proxy 1/(2\alpha(1-\alpha)) (dashed) on log axes — a shape comparison, not a tight count prediction for every \alpha. Middle right: per-step error contraction factor \rho=|1-\alpha| from the unit-Hessian linear recurrence (eq. ¿eq:scalar_linear_update?); the dashed reference at \rho=1 separates stable bars (left of it) from divergent ones (right). Bottom left: stable step-size region width 2/L per backend profile (H=I,2I,5I,10I) with the optimal \alpha^\ast=1/L overlaid. Bottom right: cross-profile contraction curves \rho(\alpha)=|1-\alpha L| with dotted verticals at each 2/L stability boundary." title="" id="78" name="Picture"/>
+            <wp:docPr descr="Figure 4: Six-panel diagnostic from generate_complexity_visualization() (3×2 grid). Top left: bars give the empirical iteration count per configured \alpha, coloured by agency category; \alpha=1.0 achieves the global minimum of 1 step(s), while \alpha=0.01 saturates at the iteration cap N_{\max}=1000 (slow convergence) and \alpha=2.5 terminates early via a non_finite update (divergence). Top right: \log_{10}|f(x)-f(x^\ast)| at termination; the four converged rows reach \approx 10^{-16} (machine precision) while \alpha=0.01 stops near 10^{-9} at the cap. Dashed reference at \log_{10}\varepsilon for \varepsilon= experiment.convergence_tolerance. Middle left: empirical iterations (solid) versus the smooth proxy 1/(2\alpha(1-\alpha)) (dashed) on log axes — a shape comparison, not a tight count prediction for every \alpha. Middle right: per-step error contraction factor \rho=|1-\alpha| from the unit-Hessian linear recurrence (eq. ¿eq:scalar_linear_update?); the dashed reference at \rho=1 separates stable bars (left of it) from divergent ones (right). Bottom left: stable step-size region width 2/L per backend profile (H=I,2I,5I,10I) with the optimal \alpha^\ast=1/L overlaid. Bottom right: cross-profile contraction curves \rho(\alpha)=|1-\alpha L| with dotted verticals at each 2/L stability boundary." title="" id="77" name="Picture"/>
             <a:graphic>
               <a:graphicData uri="http://schemas.openxmlformats.org/drawingml/2006/picture">
                 <pic:pic>
                   <pic:nvPicPr>
-                    <pic:cNvPr descr="../figures/algorithm_complexity.png" id="79" name="Picture"/>
+                    <pic:cNvPr descr="../figures/algorithm_complexity.png" id="78" name="Picture"/>
                     <pic:cNvPicPr>
                       <a:picLocks noChangeArrowheads="1" noChangeAspect="1"/>
                     </pic:cNvPicPr>
                   </pic:nvPicPr>
                   <pic:blipFill>
-                    <a:blip r:embed="rId77"/>
+                    <a:blip r:embed="rId76"/>
                     <a:stretch>
                       <a:fillRect/>
                     </a:stretch>
@@ -9806,7 +9806,7 @@
         <w:t xml:space="preserve">stability boundary.</w:t>
       </w:r>
     </w:p>
-    <w:bookmarkEnd w:id="80"/>
+    <w:bookmarkEnd w:id="79"/>
     <w:p>
       <w:pPr>
         <w:pStyle w:val="BodyText"/>
@@ -9972,8 +9972,8 @@
         <w:t xml:space="preserve">: Memory-efficient implementation suitable for high-dimensional problems</w:t>
       </w:r>
     </w:p>
-    <w:bookmarkEnd w:id="81"/>
-    <w:bookmarkStart w:id="86" w:name="performance-benchmarking-1"/>
+    <w:bookmarkEnd w:id="80"/>
+    <w:bookmarkStart w:id="85" w:name="performance-benchmarking-1"/>
     <w:p>
       <w:pPr>
         <w:pStyle w:val="Heading3"/>
@@ -10082,7 +10082,7 @@
         <w:t xml:space="preserve">.</w:t>
       </w:r>
     </w:p>
-    <w:bookmarkStart w:id="85" w:name="fig:benchmark"/>
+    <w:bookmarkStart w:id="84" w:name="fig:benchmark"/>
     <w:p>
       <w:pPr>
         <w:pStyle w:val="CaptionedFigure"/>
@@ -10092,18 +10092,18 @@
           <wp:inline>
             <wp:extent cx="5334000" cy="2251305"/>
             <wp:effectExtent b="0" l="0" r="0" t="0"/>
-            <wp:docPr descr="Figure 5: Deterministic dimensional benchmark from generate_benchmark_visualization(). Dimensions d \in \{1, 2, 5, 10, 20, 50\} run on identity-Hessian quadratics with \alpha=0.1 and gradient tolerance 10^{-10}. Left: the implementation-independent work proxy d \times \text{iterations}, proportional to scalar elements processed by the dense matrix-vector update. Right: exact iterations to convergence. Wall-clock microseconds are intentionally excluded because they vary with hardware and host load. The similar iteration counts are expected because \kappa(I_d)=1 and the contraction factor \rho=|1-\alpha|=0.9 is dimension-independent." title="" id="83" name="Picture"/>
+            <wp:docPr descr="Figure 5: Deterministic dimensional benchmark from generate_benchmark_visualization(). Dimensions d \in \{1, 2, 5, 10, 20, 50\} run on identity-Hessian quadratics with \alpha=0.1 and gradient tolerance 10^{-10}. Left: the implementation-independent work proxy d \times \text{iterations}, proportional to scalar elements processed by the dense matrix-vector update. Right: exact iterations to convergence. Wall-clock microseconds are intentionally excluded because they vary with hardware and host load. The similar iteration counts are expected because \kappa(I_d)=1 and the contraction factor \rho=|1-\alpha|=0.9 is dimension-independent." title="" id="82" name="Picture"/>
             <a:graphic>
               <a:graphicData uri="http://schemas.openxmlformats.org/drawingml/2006/picture">
                 <pic:pic>
                   <pic:nvPicPr>
-                    <pic:cNvPr descr="../figures/performance_benchmark.png" id="84" name="Picture"/>
+                    <pic:cNvPr descr="../figures/performance_benchmark.png" id="83" name="Picture"/>
                     <pic:cNvPicPr>
                       <a:picLocks noChangeArrowheads="1" noChangeAspect="1"/>
                     </pic:cNvPicPr>
                   </pic:nvPicPr>
                   <pic:blipFill>
-                    <a:blip r:embed="rId82"/>
+                    <a:blip r:embed="rId81"/>
                     <a:stretch>
                       <a:fillRect/>
                     </a:stretch>
@@ -10429,9 +10429,9 @@
         <w:t xml:space="preserve">is dimension-independent.</w:t>
       </w:r>
     </w:p>
+    <w:bookmarkEnd w:id="84"/>
     <w:bookmarkEnd w:id="85"/>
-    <w:bookmarkEnd w:id="86"/>
-    <w:bookmarkStart w:id="91" w:name="numerical-stability-analysis-1"/>
+    <w:bookmarkStart w:id="90" w:name="numerical-stability-analysis-1"/>
     <w:p>
       <w:pPr>
         <w:pStyle w:val="Heading3"/>
@@ -10578,7 +10578,7 @@
         <w:t xml:space="preserve">across the parameter space.</w:t>
       </w:r>
     </w:p>
-    <w:bookmarkStart w:id="90" w:name="fig:stability"/>
+    <w:bookmarkStart w:id="89" w:name="fig:stability"/>
     <w:p>
       <w:pPr>
         <w:pStyle w:val="CaptionedFigure"/>
@@ -10588,18 +10588,18 @@
           <wp:inline>
             <wp:extent cx="5334000" cy="2063527"/>
             <wp:effectExtent b="0" l="0" r="0" t="0"/>
-            <wp:docPr descr="Figure 6: Numerical stability heatmap from generate_stability_visualization(). Each cell shows \log_{10}|f(x)-f(x^\ast)| at termination for one (starting point x_0, step size \alpha) combination, evaluated by gradient_descent() over the 8-by-6 grid (48 cells). The leftmost column (\alpha=0.01, conservative) reaches only 10^{-6} to 10^{-9} within the iteration cap, while every other column saturates at machine precision (10^{-16}) regardless of how far x_0 starts from the optimum (range [-50, 50]). The right panel summarises this uniformity as the aggregate stability score of 1.00/1.00 returned by infrastructure.scientific.stability.check_numerical_stability(), which exercises the same objective with extreme inputs (NaN, \pm\infty, \pm 10^{10})." title="" id="88" name="Picture"/>
+            <wp:docPr descr="Figure 6: Numerical stability heatmap from generate_stability_visualization(). Each cell shows \log_{10}|f(x)-f(x^\ast)| at termination for one (starting point x_0, step size \alpha) combination, evaluated by gradient_descent() over the 8-by-6 grid (48 cells). The leftmost column (\alpha=0.01, conservative) reaches only 10^{-6} to 10^{-9} within the iteration cap, while every other column saturates at machine precision (10^{-16}) regardless of how far x_0 starts from the optimum (range [-50, 50]). The right panel summarises this uniformity as the aggregate stability score of 1.00/1.00 returned by infrastructure.scientific.stability.check_numerical_stability(), which exercises the same objective with extreme inputs (NaN, \pm\infty, \pm 10^{10})." title="" id="87" name="Picture"/>
             <a:graphic>
               <a:graphicData uri="http://schemas.openxmlformats.org/drawingml/2006/picture">
                 <pic:pic>
                   <pic:nvPicPr>
-                    <pic:cNvPr descr="../figures/stability_analysis.png" id="89" name="Picture"/>
+                    <pic:cNvPr descr="../figures/stability_analysis.png" id="88" name="Picture"/>
                     <pic:cNvPicPr>
                       <a:picLocks noChangeArrowheads="1" noChangeAspect="1"/>
                     </pic:cNvPicPr>
                   </pic:nvPicPr>
                   <pic:blipFill>
-                    <a:blip r:embed="rId87"/>
+                    <a:blip r:embed="rId86"/>
                     <a:stretch>
                       <a:fillRect/>
                     </a:stretch>
@@ -11001,9 +11001,9 @@
         <w:t xml:space="preserve">).</w:t>
       </w:r>
     </w:p>
+    <w:bookmarkEnd w:id="89"/>
     <w:bookmarkEnd w:id="90"/>
-    <w:bookmarkEnd w:id="91"/>
-    <w:bookmarkStart w:id="92" w:name="performance-metrics-summary"/>
+    <w:bookmarkStart w:id="91" w:name="performance-metrics-summary"/>
     <w:p>
       <w:pPr>
         <w:pStyle w:val="Heading3"/>
@@ -11213,9 +11213,9 @@
         <w:t xml:space="preserve">achieved for converged cases</w:t>
       </w:r>
     </w:p>
+    <w:bookmarkEnd w:id="91"/>
     <w:bookmarkEnd w:id="92"/>
-    <w:bookmarkEnd w:id="93"/>
-    <w:bookmarkStart w:id="94" w:name="validation"/>
+    <w:bookmarkStart w:id="93" w:name="validation"/>
     <w:p>
       <w:pPr>
         <w:pStyle w:val="Heading2"/>
@@ -11357,8 +11357,8 @@
         <w:t xml:space="preserve">All tests pass with coverage exceeding the 90% threshold, ensuring implementation correctness across core logic, convergence detection, and logging pathways without the use of mocks.</w:t>
       </w:r>
     </w:p>
-    <w:bookmarkEnd w:id="94"/>
-    <w:bookmarkStart w:id="95" w:name="discussion"/>
+    <w:bookmarkEnd w:id="93"/>
+    <w:bookmarkStart w:id="94" w:name="discussion"/>
     <w:p>
       <w:pPr>
         <w:pStyle w:val="Heading2"/>
@@ -11479,9 +11479,9 @@
         <w:t xml:space="preserve">module handling the Pandoc conversion.</w:t>
       </w:r>
     </w:p>
+    <w:bookmarkEnd w:id="94"/>
     <w:bookmarkEnd w:id="95"/>
-    <w:bookmarkEnd w:id="96"/>
-    <w:bookmarkStart w:id="105" w:name="sec:conclusion"/>
+    <w:bookmarkStart w:id="104" w:name="sec:conclusion"/>
     <w:p>
       <w:pPr>
         <w:pStyle w:val="Heading1"/>
@@ -11498,7 +11498,7 @@
         <w:t xml:space="preserve">This study demonstrated a complete computational research pipeline from algorithmic implementation through uncompromising testing, automated analysis, and zero-intervention manuscript generation. Ultimately, it validates the proposition that high-quality mathematical research software benefits from production-tier engineering practices.</w:t>
       </w:r>
     </w:p>
-    <w:bookmarkStart w:id="97" w:name="exemplar-project-achievements"/>
+    <w:bookmarkStart w:id="96" w:name="exemplar-project-achievements"/>
     <w:p>
       <w:pPr>
         <w:pStyle w:val="Heading2"/>
@@ -11617,8 +11617,8 @@
         <w:t xml:space="preserve">: Adhered structurally to the RASP methodology, producing verified, accessible output spanning from documentation indices to the final LLM-assisted publication configurations.</w:t>
       </w:r>
     </w:p>
-    <w:bookmarkEnd w:id="97"/>
-    <w:bookmarkStart w:id="100" w:name="technical-contributions"/>
+    <w:bookmarkEnd w:id="96"/>
+    <w:bookmarkStart w:id="99" w:name="technical-contributions"/>
     <w:p>
       <w:pPr>
         <w:pStyle w:val="Heading2"/>
@@ -11627,7 +11627,7 @@
         <w:t xml:space="preserve">Technical Contributions</w:t>
       </w:r>
     </w:p>
-    <w:bookmarkStart w:id="98" w:name="test-coverage-strategy"/>
+    <w:bookmarkStart w:id="97" w:name="test-coverage-strategy"/>
     <w:p>
       <w:pPr>
         <w:pStyle w:val="Heading3"/>
@@ -11680,8 +11680,8 @@
         <w:t xml:space="preserve">CI/CD validation gates requiring ≥90% statement coverage before progression.</w:t>
       </w:r>
     </w:p>
-    <w:bookmarkEnd w:id="98"/>
-    <w:bookmarkStart w:id="99" w:name="infrastructure-backed-capabilities"/>
+    <w:bookmarkEnd w:id="97"/>
+    <w:bookmarkStart w:id="98" w:name="infrastructure-backed-capabilities"/>
     <w:p>
       <w:pPr>
         <w:pStyle w:val="Heading3"/>
@@ -11852,9 +11852,9 @@
         <w:t xml:space="preserve">.</w:t>
       </w:r>
     </w:p>
+    <w:bookmarkEnd w:id="98"/>
     <w:bookmarkEnd w:id="99"/>
-    <w:bookmarkEnd w:id="100"/>
-    <w:bookmarkStart w:id="101" w:name="research-pipeline-validation"/>
+    <w:bookmarkStart w:id="100" w:name="research-pipeline-validation"/>
     <w:p>
       <w:pPr>
         <w:pStyle w:val="Heading2"/>
@@ -11947,8 +11947,8 @@
         <w:t xml:space="preserve">: LLM integration analyzing output completeness contextually without degrading hermetic logic.</w:t>
       </w:r>
     </w:p>
-    <w:bookmarkEnd w:id="101"/>
-    <w:bookmarkStart w:id="102" w:name="key-insights"/>
+    <w:bookmarkEnd w:id="100"/>
+    <w:bookmarkStart w:id="101" w:name="key-insights"/>
     <w:p>
       <w:pPr>
         <w:pStyle w:val="Heading2"/>
@@ -12038,8 +12038,8 @@
         <w:t xml:space="preserve">: Re-compiling the pipeline enforces an immutable bond between algorithm version and final visual reporting.</w:t>
       </w:r>
     </w:p>
-    <w:bookmarkEnd w:id="102"/>
-    <w:bookmarkStart w:id="103" w:name="future-extensions"/>
+    <w:bookmarkEnd w:id="101"/>
+    <w:bookmarkStart w:id="102" w:name="future-extensions"/>
     <w:p>
       <w:pPr>
         <w:pStyle w:val="Heading2"/>
@@ -12153,14 +12153,146 @@
         <w:t xml:space="preserve">to analyze novel model interactions automatically.</w:t>
       </w:r>
     </w:p>
+    <w:bookmarkEnd w:id="102"/>
+    <w:bookmarkStart w:id="103" w:name="final-assessment"/>
+    <w:p>
+      <w:pPr>
+        <w:pStyle w:val="Heading2"/>
+      </w:pPr>
+      <w:r>
+        <w:t xml:space="preserve">Final Assessment</w:t>
+      </w:r>
+    </w:p>
+    <w:p>
+      <w:pPr>
+        <w:pStyle w:val="FirstParagraph"/>
+      </w:pPr>
+      <w:r>
+        <w:t xml:space="preserve">This work demonstrates that the research template supports projects spanning the full spectrum—from prose-focused manuscripts to fully-tested algorithmic ecosystems. The optimization exemplar ties every quantitative claim to</w:t>
+      </w:r>
+      <w:r>
+        <w:t xml:space="preserve"> </w:t>
+      </w:r>
+      <w:r>
+        <w:rPr>
+          <w:rStyle w:val="VerbatimChar"/>
+        </w:rPr>
+        <w:t xml:space="preserve">output/data/</w:t>
+      </w:r>
+      <w:r>
+        <w:t xml:space="preserve"> </w:t>
+      </w:r>
+      <w:r>
+        <w:t xml:space="preserve">artifacts and enforces a zero-mock test policy on</w:t>
+      </w:r>
+      <w:r>
+        <w:t xml:space="preserve"> </w:t>
+      </w:r>
+      <w:r>
+        <w:rPr>
+          <w:rStyle w:val="VerbatimChar"/>
+        </w:rPr>
+        <w:t xml:space="preserve">projects/templates/template_code_project/src/</w:t>
+      </w:r>
+      <w:r>
+        <w:t xml:space="preserve"> </w:t>
+      </w:r>
+      <w:r>
+        <w:t xml:space="preserve">with coverage gates documented in the root</w:t>
+      </w:r>
+      <w:r>
+        <w:t xml:space="preserve"> </w:t>
+      </w:r>
+      <w:r>
+        <w:rPr>
+          <w:rStyle w:val="VerbatimChar"/>
+        </w:rPr>
+        <w:t xml:space="preserve">pyproject.toml</w:t>
+      </w:r>
+      <w:r>
+        <w:t xml:space="preserve">.</w:t>
+      </w:r>
+    </w:p>
+    <w:p>
+      <w:pPr>
+        <w:pStyle w:val="BodyText"/>
+      </w:pPr>
+      <w:r>
+        <w:t xml:space="preserve">The pipeline produced the figures referenced in sec. 4, wrote</w:t>
+      </w:r>
+      <w:r>
+        <w:t xml:space="preserve"> </w:t>
+      </w:r>
+      <w:r>
+        <w:rPr>
+          <w:rStyle w:val="VerbatimChar"/>
+        </w:rPr>
+        <w:t xml:space="preserve">optimization_results.csv</w:t>
+      </w:r>
+      <w:r>
+        <w:t xml:space="preserve">, and rendered this markdown (</w:t>
+      </w:r>
+      <w:r>
+        <w:rPr>
+          <w:rStyle w:val="VerbatimChar"/>
+        </w:rPr>
+        <w:t xml:space="preserve">projects/templates/template_code_project/manuscript/04_conclusion.md</w:t>
+      </w:r>
+      <w:r>
+        <w:t xml:space="preserve">) together with</w:t>
+      </w:r>
+      <w:r>
+        <w:t xml:space="preserve"> </w:t>
+      </w:r>
+      <w:r>
+        <w:rPr>
+          <w:rStyle w:val="VerbatimChar"/>
+        </w:rPr>
+        <w:t xml:space="preserve">config.yaml</w:t>
+      </w:r>
+      <w:r>
+        <w:t xml:space="preserve"> </w:t>
+      </w:r>
+      <w:r>
+        <w:t xml:space="preserve">into PDF through</w:t>
+      </w:r>
+      <w:r>
+        <w:t xml:space="preserve"> </w:t>
+      </w:r>
+      <w:r>
+        <w:rPr>
+          <w:rStyle w:val="VerbatimChar"/>
+        </w:rPr>
+        <w:t xml:space="preserve">infrastructure.rendering</w:t>
+      </w:r>
+      <w:r>
+        <w:t xml:space="preserve">. The</w:t>
+      </w:r>
+      <w:r>
+        <w:t xml:space="preserve"> </w:t>
+      </w:r>
+      <w:r>
+        <w:rPr>
+          <w:rStyle w:val="VerbatimChar"/>
+        </w:rPr>
+        <w:t xml:space="preserve">template_code_project</w:t>
+      </w:r>
+      <w:r>
+        <w:t xml:space="preserve"> </w:t>
+      </w:r>
+      <w:r>
+        <w:t xml:space="preserve">tree remains the canonical reference for how algorithm code, analysis scripts, variable injection, and manuscript stay synchronized across rebuilds.</w:t>
+      </w:r>
+    </w:p>
     <w:bookmarkEnd w:id="103"/>
-    <w:bookmarkStart w:id="104" w:name="final-assessment"/>
-    <w:p>
-      <w:pPr>
-        <w:pStyle w:val="Heading2"/>
-      </w:pPr>
-      <w:r>
-        <w:t xml:space="preserve">Final Assessment</w:t>
+    <w:bookmarkEnd w:id="104"/>
+    <w:bookmarkStart w:id="112" w:name="sec:experimental_setup"/>
+    <w:p>
+      <w:pPr>
+        <w:pStyle w:val="Heading1"/>
+      </w:pPr>
+      <w:r>
+        <w:t xml:space="preserve">Experimental Setup</w:t>
       </w:r>
     </w:p>
     <w:p>
@@ -12168,78 +12300,7 @@
         <w:pStyle w:val="FirstParagraph"/>
       </w:pPr>
       <w:r>
-        <w:t xml:space="preserve">This work demonstrates that the research template supports projects spanning the full spectrum—from prose-focused manuscripts to fully-tested algorithmic ecosystems. The optimization exemplar ties every quantitative claim to</w:t>
-      </w:r>
-      <w:r>
-        <w:t xml:space="preserve"> </w:t>
-      </w:r>
-      <w:r>
-        <w:rPr>
-          <w:rStyle w:val="VerbatimChar"/>
-        </w:rPr>
-        <w:t xml:space="preserve">output/data/</w:t>
-      </w:r>
-      <w:r>
-        <w:t xml:space="preserve"> </w:t>
-      </w:r>
-      <w:r>
-        <w:t xml:space="preserve">artifacts and enforces a zero-mock test policy on</w:t>
-      </w:r>
-      <w:r>
-        <w:t xml:space="preserve"> </w:t>
-      </w:r>
-      <w:r>
-        <w:rPr>
-          <w:rStyle w:val="VerbatimChar"/>
-        </w:rPr>
-        <w:t xml:space="preserve">projects/templates/template_code_project/src/</w:t>
-      </w:r>
-      <w:r>
-        <w:t xml:space="preserve"> </w:t>
-      </w:r>
-      <w:r>
-        <w:t xml:space="preserve">with coverage gates documented in the root</w:t>
-      </w:r>
-      <w:r>
-        <w:t xml:space="preserve"> </w:t>
-      </w:r>
-      <w:r>
-        <w:rPr>
-          <w:rStyle w:val="VerbatimChar"/>
-        </w:rPr>
-        <w:t xml:space="preserve">pyproject.toml</w:t>
-      </w:r>
-      <w:r>
-        <w:t xml:space="preserve">.</w:t>
-      </w:r>
-    </w:p>
-    <w:p>
-      <w:pPr>
-        <w:pStyle w:val="BodyText"/>
-      </w:pPr>
-      <w:r>
-        <w:t xml:space="preserve">The pipeline produced the figures referenced in sec. 4, wrote</w:t>
-      </w:r>
-      <w:r>
-        <w:t xml:space="preserve"> </w:t>
-      </w:r>
-      <w:r>
-        <w:rPr>
-          <w:rStyle w:val="VerbatimChar"/>
-        </w:rPr>
-        <w:t xml:space="preserve">optimization_results.csv</w:t>
-      </w:r>
-      <w:r>
-        <w:t xml:space="preserve">, and rendered this markdown (</w:t>
-      </w:r>
-      <w:r>
-        <w:rPr>
-          <w:rStyle w:val="VerbatimChar"/>
-        </w:rPr>
-        <w:t xml:space="preserve">projects/templates/template_code_project/manuscript/04_conclusion.md</w:t>
-      </w:r>
-      <w:r>
-        <w:t xml:space="preserve">) together with</w:t>
+        <w:t xml:space="preserve">This section details the complete experimental configuration used to generate the results in this study. Every parameter value below is injected programmatically from</w:t>
       </w:r>
       <w:r>
         <w:t xml:space="preserve"> </w:t>
@@ -12254,71 +12315,10 @@
         <w:t xml:space="preserve"> </w:t>
       </w:r>
       <w:r>
-        <w:t xml:space="preserve">into PDF through</w:t>
-      </w:r>
-      <w:r>
-        <w:t xml:space="preserve"> </w:t>
-      </w:r>
-      <w:r>
-        <w:rPr>
-          <w:rStyle w:val="VerbatimChar"/>
-        </w:rPr>
-        <w:t xml:space="preserve">infrastructure.rendering</w:t>
-      </w:r>
-      <w:r>
-        <w:t xml:space="preserve">. The</w:t>
-      </w:r>
-      <w:r>
-        <w:t xml:space="preserve"> </w:t>
-      </w:r>
-      <w:r>
-        <w:rPr>
-          <w:rStyle w:val="VerbatimChar"/>
-        </w:rPr>
-        <w:t xml:space="preserve">template_code_project</w:t>
-      </w:r>
-      <w:r>
-        <w:t xml:space="preserve"> </w:t>
-      </w:r>
-      <w:r>
-        <w:t xml:space="preserve">tree remains the canonical reference for how algorithm code, analysis scripts, variable injection, and manuscript stay synchronized across rebuilds.</w:t>
-      </w:r>
-    </w:p>
-    <w:bookmarkEnd w:id="104"/>
-    <w:bookmarkEnd w:id="105"/>
-    <w:bookmarkStart w:id="113" w:name="sec:experimental_setup"/>
-    <w:p>
-      <w:pPr>
-        <w:pStyle w:val="Heading1"/>
-      </w:pPr>
-      <w:r>
-        <w:t xml:space="preserve">Experimental Setup</w:t>
-      </w:r>
-    </w:p>
-    <w:p>
-      <w:pPr>
-        <w:pStyle w:val="FirstParagraph"/>
-      </w:pPr>
-      <w:r>
-        <w:t xml:space="preserve">This section details the complete experimental configuration used to generate the results in this study. Every parameter value below is injected programmatically from</w:t>
-      </w:r>
-      <w:r>
-        <w:t xml:space="preserve"> </w:t>
-      </w:r>
-      <w:r>
-        <w:rPr>
-          <w:rStyle w:val="VerbatimChar"/>
-        </w:rPr>
-        <w:t xml:space="preserve">config.yaml</w:t>
-      </w:r>
-      <w:r>
-        <w:t xml:space="preserve"> </w:t>
-      </w:r>
-      <w:r>
         <w:t xml:space="preserve">and the analysis pipeline — no value is hardcoded in the manuscript source.</w:t>
       </w:r>
     </w:p>
-    <w:bookmarkStart w:id="106" w:name="problem-definition"/>
+    <w:bookmarkStart w:id="105" w:name="problem-definition"/>
     <w:p>
       <w:pPr>
         <w:pStyle w:val="Heading2"/>
@@ -12531,8 +12531,8 @@
         <w:t xml:space="preserve">.</w:t>
       </w:r>
     </w:p>
-    <w:bookmarkEnd w:id="106"/>
-    <w:bookmarkStart w:id="107" w:name="parameter-space"/>
+    <w:bookmarkEnd w:id="105"/>
+    <w:bookmarkStart w:id="106" w:name="parameter-space"/>
     <w:p>
       <w:pPr>
         <w:pStyle w:val="Heading2"/>
@@ -12851,14 +12851,59 @@
         <w:t xml:space="preserve">.</w:t>
       </w:r>
     </w:p>
+    <w:bookmarkEnd w:id="106"/>
+    <w:bookmarkStart w:id="107" w:name="numerical-stability-grid"/>
+    <w:p>
+      <w:pPr>
+        <w:pStyle w:val="Heading2"/>
+      </w:pPr>
+      <w:r>
+        <w:t xml:space="preserve">Numerical Stability Grid</w:t>
+      </w:r>
+    </w:p>
+    <w:p>
+      <w:pPr>
+        <w:pStyle w:val="FirstParagraph"/>
+      </w:pPr>
+      <w:r>
+        <w:t xml:space="preserve">To validate robustness, the optimizer is exercised across a grid of 8 starting points and 6 step sizes, producing 48 total evaluations. This comprehensive sweep confirms that convergence is not an artifact of a narrow parameter choice. The stability metric is computed for the</w:t>
+      </w:r>
+      <w:r>
+        <w:t xml:space="preserve"> </w:t>
+      </w:r>
+      <w:r>
+        <w:rPr>
+          <w:rStyle w:val="VerbatimChar"/>
+        </w:rPr>
+        <w:t xml:space="preserve">quadratic_function</w:t>
+      </w:r>
+      <w:r>
+        <w:t xml:space="preserve"> </w:t>
+      </w:r>
+      <w:r>
+        <w:t xml:space="preserve">objective via</w:t>
+      </w:r>
+      <w:r>
+        <w:t xml:space="preserve"> </w:t>
+      </w:r>
+      <w:r>
+        <w:rPr>
+          <w:rStyle w:val="VerbatimChar"/>
+        </w:rPr>
+        <w:t xml:space="preserve">infrastructure.scientific.stability.check_numerical_stability()</w:t>
+      </w:r>
+      <w:r>
+        <w:t xml:space="preserve">.</w:t>
+      </w:r>
+    </w:p>
     <w:bookmarkEnd w:id="107"/>
-    <w:bookmarkStart w:id="108" w:name="numerical-stability-grid"/>
+    <w:bookmarkStart w:id="108" w:name="dimensional-scaling"/>
     <w:p>
       <w:pPr>
         <w:pStyle w:val="Heading2"/>
       </w:pPr>
       <w:r>
-        <w:t xml:space="preserve">Numerical Stability Grid</w:t>
+        <w:t xml:space="preserve">Dimensional Scaling</w:t>
       </w:r>
     </w:p>
     <w:p>
@@ -12866,182 +12911,137 @@
         <w:pStyle w:val="FirstParagraph"/>
       </w:pPr>
       <w:r>
-        <w:t xml:space="preserve">To validate robustness, the optimizer is exercised across a grid of 8 starting points and 6 step sizes, producing 48 total evaluations. This comprehensive sweep confirms that convergence is not an artifact of a narrow parameter choice. The stability metric is computed for the</w:t>
-      </w:r>
-      <w:r>
-        <w:t xml:space="preserve"> </w:t>
-      </w:r>
-      <w:r>
-        <w:rPr>
-          <w:rStyle w:val="VerbatimChar"/>
-        </w:rPr>
-        <w:t xml:space="preserve">quadratic_function</w:t>
-      </w:r>
-      <w:r>
-        <w:t xml:space="preserve"> </w:t>
-      </w:r>
-      <w:r>
-        <w:t xml:space="preserve">objective via</w:t>
-      </w:r>
-      <w:r>
-        <w:t xml:space="preserve"> </w:t>
-      </w:r>
-      <w:r>
-        <w:rPr>
-          <w:rStyle w:val="VerbatimChar"/>
-        </w:rPr>
-        <w:t xml:space="preserve">infrastructure.scientific.stability.check_numerical_stability()</w:t>
-      </w:r>
-      <w:r>
-        <w:t xml:space="preserve">.</w:t>
+        <w:t xml:space="preserve">Performance benchmarking spans problem dimensions</w:t>
+      </w:r>
+      <w:r>
+        <w:t xml:space="preserve"> </w:t>
+      </w:r>
+      <m:oMath>
+        <m:r>
+          <m:t>d</m:t>
+        </m:r>
+        <m:r>
+          <m:rPr>
+            <m:sty m:val="p"/>
+          </m:rPr>
+          <m:t>∈</m:t>
+        </m:r>
+        <m:r>
+          <m:rPr>
+            <m:sty m:val="p"/>
+          </m:rPr>
+          <m:t>{</m:t>
+        </m:r>
+        <m:r>
+          <m:t>1</m:t>
+        </m:r>
+        <m:r>
+          <m:rPr>
+            <m:sty m:val="p"/>
+          </m:rPr>
+          <m:t>,</m:t>
+        </m:r>
+        <m:r>
+          <m:t>2</m:t>
+        </m:r>
+        <m:r>
+          <m:rPr>
+            <m:sty m:val="p"/>
+          </m:rPr>
+          <m:t>,</m:t>
+        </m:r>
+        <m:r>
+          <m:t>5</m:t>
+        </m:r>
+        <m:r>
+          <m:rPr>
+            <m:sty m:val="p"/>
+          </m:rPr>
+          <m:t>,</m:t>
+        </m:r>
+        <m:r>
+          <m:t>10</m:t>
+        </m:r>
+        <m:r>
+          <m:rPr>
+            <m:sty m:val="p"/>
+          </m:rPr>
+          <m:t>,</m:t>
+        </m:r>
+        <m:r>
+          <m:t>20</m:t>
+        </m:r>
+        <m:r>
+          <m:rPr>
+            <m:sty m:val="p"/>
+          </m:rPr>
+          <m:t>,</m:t>
+        </m:r>
+        <m:r>
+          <m:t>50</m:t>
+        </m:r>
+        <m:r>
+          <m:rPr>
+            <m:sty m:val="p"/>
+          </m:rPr>
+          <m:t>}</m:t>
+        </m:r>
+      </m:oMath>
+      <w:r>
+        <w:t xml:space="preserve">, from the scalar case (</w:t>
+      </w:r>
+      <m:oMath>
+        <m:r>
+          <m:t>d</m:t>
+        </m:r>
+        <m:r>
+          <m:rPr>
+            <m:sty m:val="p"/>
+          </m:rPr>
+          <m:t>=</m:t>
+        </m:r>
+        <m:r>
+          <m:t>1</m:t>
+        </m:r>
+      </m:oMath>
+      <w:r>
+        <w:t xml:space="preserve">) to moderate dimensionality (</w:t>
+      </w:r>
+      <m:oMath>
+        <m:r>
+          <m:t>d</m:t>
+        </m:r>
+        <m:r>
+          <m:rPr>
+            <m:sty m:val="p"/>
+          </m:rPr>
+          <m:t>=</m:t>
+        </m:r>
+        <m:r>
+          <m:t>50</m:t>
+        </m:r>
+      </m:oMath>
+      <w:r>
+        <w:t xml:space="preserve">), using identity-Hessian quadratics to isolate algorithmic scaling from problem conditioning effects. The tracked</w:t>
+      </w:r>
+      <w:r>
+        <w:t xml:space="preserve"> </w:t>
+      </w:r>
+      <w:r>
+        <w:rPr>
+          <w:rStyle w:val="VerbatimChar"/>
+        </w:rPr>
+        <w:t xml:space="preserve">output/reports/performance_benchmark.json</w:t>
+      </w:r>
+      <w:r>
+        <w:t xml:space="preserve"> </w:t>
+      </w:r>
+      <w:r>
+        <w:t xml:space="preserve">records fixed inputs, exact objective values, and validation checks. Wall-clock timing is retained only as a runtime diagnostic because host load and hardware make microsecond values unsuitable as pinned reproducibility claims.</w:t>
       </w:r>
     </w:p>
     <w:bookmarkEnd w:id="108"/>
-    <w:bookmarkStart w:id="109" w:name="dimensional-scaling"/>
-    <w:p>
-      <w:pPr>
-        <w:pStyle w:val="Heading2"/>
-      </w:pPr>
-      <w:r>
-        <w:t xml:space="preserve">Dimensional Scaling</w:t>
-      </w:r>
-    </w:p>
-    <w:p>
-      <w:pPr>
-        <w:pStyle w:val="FirstParagraph"/>
-      </w:pPr>
-      <w:r>
-        <w:t xml:space="preserve">Performance benchmarking spans problem dimensions</w:t>
-      </w:r>
-      <w:r>
-        <w:t xml:space="preserve"> </w:t>
-      </w:r>
-      <m:oMath>
-        <m:r>
-          <m:t>d</m:t>
-        </m:r>
-        <m:r>
-          <m:rPr>
-            <m:sty m:val="p"/>
-          </m:rPr>
-          <m:t>∈</m:t>
-        </m:r>
-        <m:r>
-          <m:rPr>
-            <m:sty m:val="p"/>
-          </m:rPr>
-          <m:t>{</m:t>
-        </m:r>
-        <m:r>
-          <m:t>1</m:t>
-        </m:r>
-        <m:r>
-          <m:rPr>
-            <m:sty m:val="p"/>
-          </m:rPr>
-          <m:t>,</m:t>
-        </m:r>
-        <m:r>
-          <m:t>2</m:t>
-        </m:r>
-        <m:r>
-          <m:rPr>
-            <m:sty m:val="p"/>
-          </m:rPr>
-          <m:t>,</m:t>
-        </m:r>
-        <m:r>
-          <m:t>5</m:t>
-        </m:r>
-        <m:r>
-          <m:rPr>
-            <m:sty m:val="p"/>
-          </m:rPr>
-          <m:t>,</m:t>
-        </m:r>
-        <m:r>
-          <m:t>10</m:t>
-        </m:r>
-        <m:r>
-          <m:rPr>
-            <m:sty m:val="p"/>
-          </m:rPr>
-          <m:t>,</m:t>
-        </m:r>
-        <m:r>
-          <m:t>20</m:t>
-        </m:r>
-        <m:r>
-          <m:rPr>
-            <m:sty m:val="p"/>
-          </m:rPr>
-          <m:t>,</m:t>
-        </m:r>
-        <m:r>
-          <m:t>50</m:t>
-        </m:r>
-        <m:r>
-          <m:rPr>
-            <m:sty m:val="p"/>
-          </m:rPr>
-          <m:t>}</m:t>
-        </m:r>
-      </m:oMath>
-      <w:r>
-        <w:t xml:space="preserve">, from the scalar case (</w:t>
-      </w:r>
-      <m:oMath>
-        <m:r>
-          <m:t>d</m:t>
-        </m:r>
-        <m:r>
-          <m:rPr>
-            <m:sty m:val="p"/>
-          </m:rPr>
-          <m:t>=</m:t>
-        </m:r>
-        <m:r>
-          <m:t>1</m:t>
-        </m:r>
-      </m:oMath>
-      <w:r>
-        <w:t xml:space="preserve">) to moderate dimensionality (</w:t>
-      </w:r>
-      <m:oMath>
-        <m:r>
-          <m:t>d</m:t>
-        </m:r>
-        <m:r>
-          <m:rPr>
-            <m:sty m:val="p"/>
-          </m:rPr>
-          <m:t>=</m:t>
-        </m:r>
-        <m:r>
-          <m:t>50</m:t>
-        </m:r>
-      </m:oMath>
-      <w:r>
-        <w:t xml:space="preserve">), using identity-Hessian quadratics to isolate algorithmic scaling from problem conditioning effects. The tracked</w:t>
-      </w:r>
-      <w:r>
-        <w:t xml:space="preserve"> </w:t>
-      </w:r>
-      <w:r>
-        <w:rPr>
-          <w:rStyle w:val="VerbatimChar"/>
-        </w:rPr>
-        <w:t xml:space="preserve">output/reports/performance_benchmark.json</w:t>
-      </w:r>
-      <w:r>
-        <w:t xml:space="preserve"> </w:t>
-      </w:r>
-      <w:r>
-        <w:t xml:space="preserve">records fixed inputs, exact objective values, and validation checks. Wall-clock timing is retained only as a runtime diagnostic because host load and hardware make microsecond values unsuitable as pinned reproducibility claims.</w:t>
-      </w:r>
-    </w:p>
-    <w:bookmarkEnd w:id="109"/>
-    <w:bookmarkStart w:id="110" w:name="computational-environment"/>
+    <w:bookmarkStart w:id="109" w:name="computational-environment"/>
     <w:p>
       <w:pPr>
         <w:pStyle w:val="Heading2"/>
@@ -13126,8 +13126,8 @@
         <w:t xml:space="preserve">: 2026-08-14T14:20:53Z</w:t>
       </w:r>
     </w:p>
-    <w:bookmarkEnd w:id="110"/>
-    <w:bookmarkStart w:id="111" w:name="pipeline-ordering"/>
+    <w:bookmarkEnd w:id="109"/>
+    <w:bookmarkStart w:id="110" w:name="pipeline-ordering"/>
     <w:p>
       <w:pPr>
         <w:pStyle w:val="Heading2"/>
@@ -13323,8 +13323,8 @@
         <w:t xml:space="preserve">so that figure paths and numeric tables match the analysis that just completed.</w:t>
       </w:r>
     </w:p>
-    <w:bookmarkEnd w:id="111"/>
-    <w:bookmarkStart w:id="112" w:name="relation-to-figures"/>
+    <w:bookmarkEnd w:id="110"/>
+    <w:bookmarkStart w:id="111" w:name="relation-to-figures"/>
     <w:p>
       <w:pPr>
         <w:pStyle w:val="Heading2"/>
@@ -13676,9 +13676,9 @@
         <w:t xml:space="preserve">This table is descriptive documentation only; it is not executed as code during the build.</w:t>
       </w:r>
     </w:p>
+    <w:bookmarkEnd w:id="111"/>
     <w:bookmarkEnd w:id="112"/>
-    <w:bookmarkEnd w:id="113"/>
-    <w:bookmarkStart w:id="121" w:name="sec:reproducibility"/>
+    <w:bookmarkStart w:id="120" w:name="sec:reproducibility"/>
     <w:p>
       <w:pPr>
         <w:pStyle w:val="Heading1"/>
@@ -13695,7 +13695,7 @@
         <w:t xml:space="preserve">This section provides a machine-verifiable reproducibility certificate for the complete study. Every metric below is computed by the analysis pipeline and injected into the manuscript at render time — establishing a cryptographic chain of custody from configuration to publication.</w:t>
       </w:r>
     </w:p>
-    <w:bookmarkStart w:id="114" w:name="configuration-provenance"/>
+    <w:bookmarkStart w:id="113" w:name="configuration-provenance"/>
     <w:p>
       <w:pPr>
         <w:pStyle w:val="Heading2"/>
@@ -13865,8 +13865,8 @@
         <w:t xml:space="preserve">is modified, ensuring that every rendered PDF is traceable to a specific configuration state.</w:t>
       </w:r>
     </w:p>
-    <w:bookmarkEnd w:id="114"/>
-    <w:bookmarkStart w:id="115" w:name="generated-artifact-registry"/>
+    <w:bookmarkEnd w:id="113"/>
+    <w:bookmarkStart w:id="114" w:name="generated-artifact-registry"/>
     <w:p>
       <w:pPr>
         <w:pStyle w:val="Heading2"/>
@@ -14037,8 +14037,8 @@
         </w:tc>
       </w:tr>
     </w:tbl>
-    <w:bookmarkEnd w:id="115"/>
-    <w:bookmarkStart w:id="119" w:name="numerical-validation-summary"/>
+    <w:bookmarkEnd w:id="114"/>
+    <w:bookmarkStart w:id="118" w:name="numerical-validation-summary"/>
     <w:p>
       <w:pPr>
         <w:pStyle w:val="Heading2"/>
@@ -14047,7 +14047,7 @@
         <w:t xml:space="preserve">Numerical Validation Summary</w:t>
       </w:r>
     </w:p>
-    <w:bookmarkStart w:id="116" w:name="convergence-verification"/>
+    <w:bookmarkStart w:id="115" w:name="convergence-verification"/>
     <w:p>
       <w:pPr>
         <w:pStyle w:val="Heading3"/>
@@ -14238,8 +14238,8 @@
         <w:t xml:space="preserve">Mean iterations across all rows: 351</w:t>
       </w:r>
     </w:p>
-    <w:bookmarkEnd w:id="116"/>
-    <w:bookmarkStart w:id="117" w:name="numerical-stability"/>
+    <w:bookmarkEnd w:id="115"/>
+    <w:bookmarkStart w:id="116" w:name="numerical-stability"/>
     <w:p>
       <w:pPr>
         <w:pStyle w:val="Heading3"/>
@@ -14309,138 +14309,138 @@
         <w:t xml:space="preserve">6 step sizes), confirming uniform convergence across the entire parameter space.</w:t>
       </w:r>
     </w:p>
+    <w:bookmarkEnd w:id="116"/>
+    <w:bookmarkStart w:id="117" w:name="benchmark-demonstration"/>
+    <w:p>
+      <w:pPr>
+        <w:pStyle w:val="Heading3"/>
+      </w:pPr>
+      <w:r>
+        <w:t xml:space="preserve">Benchmark Demonstration</w:t>
+      </w:r>
+    </w:p>
+    <w:p>
+      <w:pPr>
+        <w:pStyle w:val="FirstParagraph"/>
+      </w:pPr>
+      <w:r>
+        <w:t xml:space="preserve">This exemplar also demonstrates</w:t>
+      </w:r>
+      <w:r>
+        <w:t xml:space="preserve"> </w:t>
+      </w:r>
+      <w:r>
+        <w:rPr>
+          <w:rStyle w:val="VerbatimChar"/>
+        </w:rPr>
+        <w:t xml:space="preserve">infrastructure.benchmark</w:t>
+      </w:r>
+      <w:r>
+        <w:t xml:space="preserve">. The thin orchestrator</w:t>
+      </w:r>
+      <w:r>
+        <w:t xml:space="preserve"> </w:t>
+      </w:r>
+      <w:r>
+        <w:rPr>
+          <w:rStyle w:val="VerbatimChar"/>
+        </w:rPr>
+        <w:t xml:space="preserve">scripts/04_benchmark_stage.py</w:t>
+      </w:r>
+      <w:r>
+        <w:t xml:space="preserve"> </w:t>
+      </w:r>
+      <w:r>
+        <w:t xml:space="preserve">calls</w:t>
+      </w:r>
+      <w:r>
+        <w:t xml:space="preserve"> </w:t>
+      </w:r>
+      <w:r>
+        <w:rPr>
+          <w:rStyle w:val="VerbatimChar"/>
+        </w:rPr>
+        <w:t xml:space="preserve">src/benchmark_support.py</w:t>
+      </w:r>
+      <w:r>
+        <w:t xml:space="preserve">, which evaluates the pure</w:t>
+      </w:r>
+      <w:r>
+        <w:t xml:space="preserve"> </w:t>
+      </w:r>
+      <w:r>
+        <w:rPr>
+          <w:rStyle w:val="VerbatimChar"/>
+        </w:rPr>
+        <w:t xml:space="preserve">quadratic_function</w:t>
+      </w:r>
+      <w:r>
+        <w:t xml:space="preserve"> </w:t>
+      </w:r>
+      <w:r>
+        <w:t xml:space="preserve">across fixed seeded inputs and turns reproducible completion, finiteness, and output-stability facts into boolean rubric checks. Those checks are scored through</w:t>
+      </w:r>
+      <w:r>
+        <w:t xml:space="preserve"> </w:t>
+      </w:r>
+      <w:r>
+        <w:rPr>
+          <w:rStyle w:val="VerbatimChar"/>
+        </w:rPr>
+        <w:t xml:space="preserve">infrastructure.benchmark.score_rubric</w:t>
+      </w:r>
+      <w:r>
+        <w:t xml:space="preserve"> </w:t>
+      </w:r>
+      <w:r>
+        <w:t xml:space="preserve">against a weighted</w:t>
+      </w:r>
+      <w:r>
+        <w:t xml:space="preserve"> </w:t>
+      </w:r>
+      <w:r>
+        <w:rPr>
+          <w:rStyle w:val="VerbatimChar"/>
+        </w:rPr>
+        <w:t xml:space="preserve">RubricSet</w:t>
+      </w:r>
+      <w:r>
+        <w:t xml:space="preserve">, then rendered with</w:t>
+      </w:r>
+      <w:r>
+        <w:t xml:space="preserve"> </w:t>
+      </w:r>
+      <w:r>
+        <w:rPr>
+          <w:rStyle w:val="VerbatimChar"/>
+        </w:rPr>
+        <w:t xml:space="preserve">scores_to_markdown</w:t>
+      </w:r>
+      <w:r>
+        <w:t xml:space="preserve"> </w:t>
+      </w:r>
+      <w:r>
+        <w:t xml:space="preserve">into the byte-stable</w:t>
+      </w:r>
+      <w:r>
+        <w:t xml:space="preserve"> </w:t>
+      </w:r>
+      <w:r>
+        <w:rPr>
+          <w:rStyle w:val="VerbatimChar"/>
+        </w:rPr>
+        <w:t xml:space="preserve">output/reports/benchmark_report.json</w:t>
+      </w:r>
+      <w:r>
+        <w:t xml:space="preserve"> </w:t>
+      </w:r>
+      <w:r>
+        <w:t xml:space="preserve">with a deterministic objective-value figure. Real timing still executes as a runtime diagnostic, but it is not serialized into tracked evidence.</w:t>
+      </w:r>
+    </w:p>
     <w:bookmarkEnd w:id="117"/>
-    <w:bookmarkStart w:id="118" w:name="benchmark-demonstration"/>
-    <w:p>
-      <w:pPr>
-        <w:pStyle w:val="Heading3"/>
-      </w:pPr>
-      <w:r>
-        <w:t xml:space="preserve">Benchmark Demonstration</w:t>
-      </w:r>
-    </w:p>
-    <w:p>
-      <w:pPr>
-        <w:pStyle w:val="FirstParagraph"/>
-      </w:pPr>
-      <w:r>
-        <w:t xml:space="preserve">This exemplar also demonstrates</w:t>
-      </w:r>
-      <w:r>
-        <w:t xml:space="preserve"> </w:t>
-      </w:r>
-      <w:r>
-        <w:rPr>
-          <w:rStyle w:val="VerbatimChar"/>
-        </w:rPr>
-        <w:t xml:space="preserve">infrastructure.benchmark</w:t>
-      </w:r>
-      <w:r>
-        <w:t xml:space="preserve">. The thin orchestrator</w:t>
-      </w:r>
-      <w:r>
-        <w:t xml:space="preserve"> </w:t>
-      </w:r>
-      <w:r>
-        <w:rPr>
-          <w:rStyle w:val="VerbatimChar"/>
-        </w:rPr>
-        <w:t xml:space="preserve">scripts/04_benchmark_stage.py</w:t>
-      </w:r>
-      <w:r>
-        <w:t xml:space="preserve"> </w:t>
-      </w:r>
-      <w:r>
-        <w:t xml:space="preserve">calls</w:t>
-      </w:r>
-      <w:r>
-        <w:t xml:space="preserve"> </w:t>
-      </w:r>
-      <w:r>
-        <w:rPr>
-          <w:rStyle w:val="VerbatimChar"/>
-        </w:rPr>
-        <w:t xml:space="preserve">src/benchmark_support.py</w:t>
-      </w:r>
-      <w:r>
-        <w:t xml:space="preserve">, which evaluates the pure</w:t>
-      </w:r>
-      <w:r>
-        <w:t xml:space="preserve"> </w:t>
-      </w:r>
-      <w:r>
-        <w:rPr>
-          <w:rStyle w:val="VerbatimChar"/>
-        </w:rPr>
-        <w:t xml:space="preserve">quadratic_function</w:t>
-      </w:r>
-      <w:r>
-        <w:t xml:space="preserve"> </w:t>
-      </w:r>
-      <w:r>
-        <w:t xml:space="preserve">across fixed seeded inputs and turns reproducible completion, finiteness, and output-stability facts into boolean rubric checks. Those checks are scored through</w:t>
-      </w:r>
-      <w:r>
-        <w:t xml:space="preserve"> </w:t>
-      </w:r>
-      <w:r>
-        <w:rPr>
-          <w:rStyle w:val="VerbatimChar"/>
-        </w:rPr>
-        <w:t xml:space="preserve">infrastructure.benchmark.score_rubric</w:t>
-      </w:r>
-      <w:r>
-        <w:t xml:space="preserve"> </w:t>
-      </w:r>
-      <w:r>
-        <w:t xml:space="preserve">against a weighted</w:t>
-      </w:r>
-      <w:r>
-        <w:t xml:space="preserve"> </w:t>
-      </w:r>
-      <w:r>
-        <w:rPr>
-          <w:rStyle w:val="VerbatimChar"/>
-        </w:rPr>
-        <w:t xml:space="preserve">RubricSet</w:t>
-      </w:r>
-      <w:r>
-        <w:t xml:space="preserve">, then rendered with</w:t>
-      </w:r>
-      <w:r>
-        <w:t xml:space="preserve"> </w:t>
-      </w:r>
-      <w:r>
-        <w:rPr>
-          <w:rStyle w:val="VerbatimChar"/>
-        </w:rPr>
-        <w:t xml:space="preserve">scores_to_markdown</w:t>
-      </w:r>
-      <w:r>
-        <w:t xml:space="preserve"> </w:t>
-      </w:r>
-      <w:r>
-        <w:t xml:space="preserve">into the byte-stable</w:t>
-      </w:r>
-      <w:r>
-        <w:t xml:space="preserve"> </w:t>
-      </w:r>
-      <w:r>
-        <w:rPr>
-          <w:rStyle w:val="VerbatimChar"/>
-        </w:rPr>
-        <w:t xml:space="preserve">output/reports/benchmark_report.json</w:t>
-      </w:r>
-      <w:r>
-        <w:t xml:space="preserve"> </w:t>
-      </w:r>
-      <w:r>
-        <w:t xml:space="preserve">with a deterministic objective-value figure. Real timing still executes as a runtime diagnostic, but it is not serialized into tracked evidence.</w:t>
-      </w:r>
-    </w:p>
     <w:bookmarkEnd w:id="118"/>
-    <w:bookmarkEnd w:id="119"/>
-    <w:bookmarkStart w:id="120" w:name="madlib-injection-verification"/>
+    <w:bookmarkStart w:id="119" w:name="madlib-injection-verification"/>
     <w:p>
       <w:pPr>
         <w:pStyle w:val="Heading2"/>
@@ -14613,9 +14613,9 @@
         <w:t xml:space="preserve">and re-running the pipeline will automatically update every corresponding claim in this document. No manual transcription is required or permitted.</w:t>
       </w:r>
     </w:p>
+    <w:bookmarkEnd w:id="119"/>
     <w:bookmarkEnd w:id="120"/>
-    <w:bookmarkEnd w:id="121"/>
-    <w:bookmarkStart w:id="126" w:name="sec:scope"/>
+    <w:bookmarkStart w:id="125" w:name="sec:scope"/>
     <w:p>
       <w:pPr>
         <w:pStyle w:val="Heading1"/>
@@ -14650,7 +14650,7 @@
         <w:t xml:space="preserve">.</w:t>
       </w:r>
     </w:p>
-    <w:bookmarkStart w:id="122" w:name="classical-gradient-methods"/>
+    <w:bookmarkStart w:id="121" w:name="classical-gradient-methods"/>
     <w:p>
       <w:pPr>
         <w:pStyle w:val="Heading2"/>
@@ -14748,8 +14748,8 @@
         <w:t xml:space="preserve">).</w:t>
       </w:r>
     </w:p>
-    <w:bookmarkEnd w:id="122"/>
-    <w:bookmarkStart w:id="123" w:name="adaptive-and-stochastic-extensions"/>
+    <w:bookmarkEnd w:id="121"/>
+    <w:bookmarkStart w:id="122" w:name="adaptive-and-stochastic-extensions"/>
     <w:p>
       <w:pPr>
         <w:pStyle w:val="Heading2"/>
@@ -14814,8 +14814,8 @@
         <w:t xml:space="preserve">, iteration caps) are interpretable without confounding from stochastic sampling or line-search logic.</w:t>
       </w:r>
     </w:p>
-    <w:bookmarkEnd w:id="123"/>
-    <w:bookmarkStart w:id="124" w:name="X3bc48e80992a743b1055962b61fae9f317fec48"/>
+    <w:bookmarkEnd w:id="122"/>
+    <w:bookmarkStart w:id="123" w:name="X3bc48e80992a743b1055962b61fae9f317fec48"/>
     <w:p>
       <w:pPr>
         <w:pStyle w:val="Heading2"/>
@@ -14899,8 +14899,8 @@
         <w:t xml:space="preserve">) so that PDF, HTML, and validation logs refer to the same numbers. That pattern is what downstream projects should copy—whether the domain is optimization, differential equations, or Bayesian workflows.</w:t>
       </w:r>
     </w:p>
-    <w:bookmarkEnd w:id="124"/>
-    <w:bookmarkStart w:id="125" w:name="explicit-limitations"/>
+    <w:bookmarkEnd w:id="123"/>
+    <w:bookmarkStart w:id="124" w:name="explicit-limitations"/>
     <w:p>
       <w:pPr>
         <w:pStyle w:val="Heading2"/>
@@ -15088,9 +15088,9 @@
         <w:t xml:space="preserve">These limitations are intentional: they narrow the failure surface so that infrastructure concerns—tests, logging, figure registration, and PDF cross-references—remain visible rather than buried under algorithmic complexity.</w:t>
       </w:r>
     </w:p>
+    <w:bookmarkEnd w:id="124"/>
     <w:bookmarkEnd w:id="125"/>
-    <w:bookmarkEnd w:id="126"/>
-    <w:bookmarkStart w:id="146" w:name="sec:references"/>
+    <w:bookmarkStart w:id="145" w:name="sec:references"/>
     <w:p>
       <w:pPr>
         <w:pStyle w:val="Heading1"/>
@@ -15109,7 +15109,7 @@
       <w:r>
         <w:t xml:space="preserve"> </w:t>
       </w:r>
-      <w:hyperlink r:id="rId127">
+      <w:hyperlink r:id="rId126">
         <w:r>
           <w:rPr>
             <w:rStyle w:val="VerbatimChar"/>
@@ -15314,12 +15314,12 @@
           <wp:inline>
             <wp:extent cx="4693920" cy="1777647"/>
             <wp:effectExtent b="0" l="0" r="0" t="0"/>
-            <wp:docPr descr="Integrity QR strip" title="" id="128" name="Picture"/>
+            <wp:docPr descr="Integrity QR strip" title="" id="127" name="Picture"/>
             <a:graphic>
               <a:graphicData uri="http://schemas.openxmlformats.org/drawingml/2006/picture">
                 <pic:pic>
                   <pic:nvPicPr>
-                    <pic:cNvPr descr="../figures/transmission_integrity_strip.png" id="129" name="Picture"/>
+                    <pic:cNvPr descr="../figures/transmission_integrity_strip.png" id="128" name="Picture"/>
                     <pic:cNvPicPr>
                       <a:picLocks noChangeArrowheads="1" noChangeAspect="1"/>
                     </pic:cNvPicPr>
@@ -15382,8 +15382,8 @@
         <w:t xml:space="preserve">No prior releases.</w:t>
       </w:r>
     </w:p>
-    <w:bookmarkStart w:id="145" w:name="refs"/>
-    <w:bookmarkStart w:id="130" w:name="ref-bertsekas1999nonlinear"/>
+    <w:bookmarkStart w:id="144" w:name="refs"/>
+    <w:bookmarkStart w:id="129" w:name="ref-bertsekas1999nonlinear"/>
     <w:p>
       <w:pPr>
         <w:pStyle w:val="Bibliography"/>
@@ -15405,8 +15405,8 @@
         <w:t xml:space="preserve">. 2nd ed. Athena Scientific.</w:t>
       </w:r>
     </w:p>
-    <w:bookmarkEnd w:id="130"/>
-    <w:bookmarkStart w:id="132" w:name="ref-boyd2004convex"/>
+    <w:bookmarkEnd w:id="129"/>
+    <w:bookmarkStart w:id="131" w:name="ref-boyd2004convex"/>
     <w:p>
       <w:pPr>
         <w:pStyle w:val="Bibliography"/>
@@ -15430,7 +15430,7 @@
       <w:r>
         <w:t xml:space="preserve"> </w:t>
       </w:r>
-      <w:hyperlink r:id="rId131">
+      <w:hyperlink r:id="rId130">
         <w:r>
           <w:rPr>
             <w:rStyle w:val="Hyperlink"/>
@@ -15442,8 +15442,8 @@
         <w:t xml:space="preserve">.</w:t>
       </w:r>
     </w:p>
-    <w:bookmarkEnd w:id="132"/>
-    <w:bookmarkStart w:id="134" w:name="ref-cauchy1847methode"/>
+    <w:bookmarkEnd w:id="131"/>
+    <w:bookmarkStart w:id="133" w:name="ref-cauchy1847methode"/>
     <w:p>
       <w:pPr>
         <w:pStyle w:val="Bibliography"/>
@@ -15476,7 +15476,7 @@
       <w:r>
         <w:t xml:space="preserve"> </w:t>
       </w:r>
-      <w:hyperlink r:id="rId133">
+      <w:hyperlink r:id="rId132">
         <w:r>
           <w:rPr>
             <w:rStyle w:val="Hyperlink"/>
@@ -15488,8 +15488,8 @@
         <w:t xml:space="preserve">.</w:t>
       </w:r>
     </w:p>
-    <w:bookmarkEnd w:id="134"/>
-    <w:bookmarkStart w:id="136" w:name="ref-kingma2014adam"/>
+    <w:bookmarkEnd w:id="133"/>
+    <w:bookmarkStart w:id="135" w:name="ref-kingma2014adam"/>
     <w:p>
       <w:pPr>
         <w:pStyle w:val="Bibliography"/>
@@ -15528,7 +15528,7 @@
       <w:r>
         <w:t xml:space="preserve"> </w:t>
       </w:r>
-      <w:hyperlink r:id="rId135">
+      <w:hyperlink r:id="rId134">
         <w:r>
           <w:rPr>
             <w:rStyle w:val="Hyperlink"/>
@@ -15540,8 +15540,8 @@
         <w:t xml:space="preserve">.</w:t>
       </w:r>
     </w:p>
-    <w:bookmarkEnd w:id="136"/>
-    <w:bookmarkStart w:id="138" w:name="ref-nesterov2013gradient"/>
+    <w:bookmarkEnd w:id="135"/>
+    <w:bookmarkStart w:id="137" w:name="ref-nesterov2013gradient"/>
     <w:p>
       <w:pPr>
         <w:pStyle w:val="Bibliography"/>
@@ -15574,7 +15574,7 @@
       <w:r>
         <w:t xml:space="preserve"> </w:t>
       </w:r>
-      <w:hyperlink r:id="rId137">
+      <w:hyperlink r:id="rId136">
         <w:r>
           <w:rPr>
             <w:rStyle w:val="Hyperlink"/>
@@ -15586,8 +15586,8 @@
         <w:t xml:space="preserve">.</w:t>
       </w:r>
     </w:p>
-    <w:bookmarkEnd w:id="138"/>
-    <w:bookmarkStart w:id="140" w:name="ref-nocedal2006numerical"/>
+    <w:bookmarkEnd w:id="137"/>
+    <w:bookmarkStart w:id="139" w:name="ref-nocedal2006numerical"/>
     <w:p>
       <w:pPr>
         <w:pStyle w:val="Bibliography"/>
@@ -15611,7 +15611,7 @@
       <w:r>
         <w:t xml:space="preserve"> </w:t>
       </w:r>
-      <w:hyperlink r:id="rId139">
+      <w:hyperlink r:id="rId138">
         <w:r>
           <w:rPr>
             <w:rStyle w:val="Hyperlink"/>
@@ -15623,8 +15623,8 @@
         <w:t xml:space="preserve">.</w:t>
       </w:r>
     </w:p>
-    <w:bookmarkEnd w:id="140"/>
-    <w:bookmarkStart w:id="142" w:name="ref-peng2011reproducible"/>
+    <w:bookmarkEnd w:id="139"/>
+    <w:bookmarkStart w:id="141" w:name="ref-peng2011reproducible"/>
     <w:p>
       <w:pPr>
         <w:pStyle w:val="Bibliography"/>
@@ -15657,7 +15657,7 @@
       <w:r>
         <w:t xml:space="preserve"> </w:t>
       </w:r>
-      <w:hyperlink r:id="rId141">
+      <w:hyperlink r:id="rId140">
         <w:r>
           <w:rPr>
             <w:rStyle w:val="Hyperlink"/>
@@ -15669,8 +15669,8 @@
         <w:t xml:space="preserve">.</w:t>
       </w:r>
     </w:p>
-    <w:bookmarkEnd w:id="142"/>
-    <w:bookmarkStart w:id="144" w:name="ref-polyak1964some"/>
+    <w:bookmarkEnd w:id="141"/>
+    <w:bookmarkStart w:id="143" w:name="ref-polyak1964some"/>
     <w:p>
       <w:pPr>
         <w:pStyle w:val="Bibliography"/>
@@ -15703,7 +15703,7 @@
       <w:r>
         <w:t xml:space="preserve"> </w:t>
       </w:r>
-      <w:hyperlink r:id="rId143">
+      <w:hyperlink r:id="rId142">
         <w:r>
           <w:rPr>
             <w:rStyle w:val="Hyperlink"/>
@@ -15715,9 +15715,9 @@
         <w:t xml:space="preserve">.</w:t>
       </w:r>
     </w:p>
+    <w:bookmarkEnd w:id="143"/>
     <w:bookmarkEnd w:id="144"/>
     <w:bookmarkEnd w:id="145"/>
-    <w:bookmarkEnd w:id="146"/>
     <w:sectPr>
       <w:footnotePr>
         <w:numRestart w:val="eachSect"/>

</xml_diff>